<commit_message>
Habilitação de herdeiros: retira pedido de levantamento de valores
Co-Authored-By: Claude Opus 5.5 <noreply@anthropic.com>
Claude-Session: https://claude.ai/code/session_01RSEcSvs1Px517d8mUYokdi
</commit_message>
<xml_diff>
--- a/0800122-42.2025 - Francisca Sousa/Habilitação de herdeiros - Francisca Sousa da Silva.docx
+++ b/0800122-42.2025 - Francisca Sousa/Habilitação de herdeiros - Francisca Sousa da Silva.docx
@@ -502,7 +502,7 @@
       </w:r>
       <w:r>
         <w:rPr/>
-        <w:t>, sem que isso importe renúncia, cessão ou doação da quota hereditária. [Doc. 05]</w:t>
+        <w:t>, sem que isso importe renúncia, cessão ou doação da quota hereditária. [Doc. 05] O levantamento dos valores depositados será requerido oportunamente, em momento próprio.</w:t>
       </w:r>
     </w:p>
     <w:p>
@@ -602,74 +602,6 @@
     <w:p>
       <w:pPr>
         <w:keepNext/>
-        <w:spacing w:before="240" w:after="160" w:line="360" w:lineRule="auto"/>
-        <w:ind w:left="700" w:hanging="400"/>
-      </w:pPr>
-      <w:r>
-        <w:rPr>
-          <w:b/>
-        </w:rPr>
-        <w:t>e.</w:t>
-        <w:tab/>
-        <w:t>Do levantamento dos valores e do destaque dos honorários contratuais:</w:t>
-      </w:r>
-    </w:p>
-    <w:p>
-      <w:pPr>
-        <w:spacing w:line="360" w:lineRule="auto" w:after="60"/>
-        <w:ind w:firstLine="850"/>
-        <w:jc w:val="both"/>
-      </w:pPr>
-      <w:r>
-        <w:rPr/>
-        <w:t>Há nos autos depósitos judiciais feitos pelo executado (IDs 95988160, 95988161 e 103392321). A decisão do Relator do agravo de instrumento suspendeu apenas a exigibilidade da parcela controvertida e ressalvou expressamente “a manutenção da execução quanto à parcela eventualmente incontroversa”.</w:t>
-      </w:r>
-    </w:p>
-    <w:p>
-      <w:pPr>
-        <w:spacing w:line="360" w:lineRule="auto" w:after="60"/>
-        <w:ind w:firstLine="850"/>
-        <w:jc w:val="both"/>
-      </w:pPr>
-      <w:r>
-        <w:rPr/>
-        <w:t xml:space="preserve">Deferida a habilitação, requer-se a expedição de alvará da </w:t>
-      </w:r>
-      <w:r>
-        <w:rPr>
-          <w:b/>
-        </w:rPr>
-        <w:t>parcela incontroversa</w:t>
-      </w:r>
-      <w:r>
-        <w:rPr/>
-        <w:t>, assim reconhecida pelo próprio executado (R$ 4.641,14 – ID 95988161, com seus rendimentos). Os demais valores devem ser levantados após o julgamento do agravo, sempre na proporção de 50% ao cônjuge meeiro e 12,5% a cada filho.</w:t>
-      </w:r>
-    </w:p>
-    <w:p>
-      <w:pPr>
-        <w:spacing w:line="360" w:lineRule="auto" w:after="60"/>
-        <w:ind w:firstLine="850"/>
-        <w:jc w:val="both"/>
-      </w:pPr>
-      <w:r>
-        <w:rPr/>
-        <w:t xml:space="preserve">Requer-se também o </w:t>
-      </w:r>
-      <w:r>
-        <w:rPr>
-          <w:b/>
-        </w:rPr>
-        <w:t>destaque dos honorários advocatícios contratuais</w:t>
-      </w:r>
-      <w:r>
-        <w:rPr/>
-        <w:t>, na forma do art. 22, § 4º, da Lei nº 8.906/1994, mediante a juntada do contrato de honorários [Doc. 06]. Os sucessores manifestaram expressa concordância com esse destaque. Os honorários sucumbenciais pertencem ao advogado e devem ser levantados em seu nome (art. 23 da Lei nº 8.906/1994).</w:t>
-      </w:r>
-    </w:p>
-    <w:p>
-      <w:pPr>
-        <w:keepNext/>
         <w:spacing w:before="360" w:after="240" w:line="360" w:lineRule="auto"/>
       </w:pPr>
       <w:r>
@@ -830,19 +762,6 @@
         <w:rPr/>
         <w:t>g)</w:t>
         <w:tab/>
-        <w:t>deferida a habilitação, a expedição de alvará da parcela incontroversa depositada (ID 95988161), com seus rendimentos, e, oportunamente, dos demais valores. Requer-se que o levantamento seja feito em favor de MANOEL LOPES DA SILVA, como meeiro e mandatário dos demais herdeiros, conforme as autorizações anexas, ou em favor do advogado subscritor, que tem poderes para receber e dar quitação. Devem ser observados a proporção de 50% ao meeiro e 12,5% a cada filho, o destaque dos honorários contratuais (art. 22, § 4º, da Lei nº 8.906/1994) e o levantamento dos honorários sucumbenciais em nome do advogado;</w:t>
-      </w:r>
-    </w:p>
-    <w:p>
-      <w:pPr>
-        <w:spacing w:line="360" w:lineRule="auto" w:after="120"/>
-        <w:ind w:left="1134" w:hanging="567"/>
-        <w:jc w:val="both"/>
-      </w:pPr>
-      <w:r>
-        <w:rPr/>
-        <w:t>h)</w:t>
-        <w:tab/>
         <w:t>que todas as intimações sejam feitas em nome do advogado ANTÔNIO DE PÁDUA SANTOS NETO, OAB/PI 21.320, sob pena de nulidade.</w:t>
       </w:r>
     </w:p>
@@ -921,13 +840,13 @@
       </w:pPr>
       <w:r>
         <w:rPr/>
-        <w:t xml:space="preserve">[Doc. 06 – Contrato de honorários advocatícios;] </w:t>
+        <w:t xml:space="preserve">[Doc. 06 – Documentos pessoais (RG e CPF) e comprovantes de residência dos requerentes;] </w:t>
       </w:r>
       <w:r>
         <w:rPr>
           <w:highlight w:val="yellow"/>
         </w:rPr>
-        <w:t>(juntar)</w:t>
+        <w:t>(conferir RG/CPF de todos e comprovantes de Manoel, Joel e Jailene)</w:t>
       </w:r>
     </w:p>
     <w:p>
@@ -936,22 +855,7 @@
       </w:pPr>
       <w:r>
         <w:rPr/>
-        <w:t xml:space="preserve">[Doc. 07 – Documentos pessoais (RG e CPF) e comprovantes de residência dos requerentes;] </w:t>
-      </w:r>
-      <w:r>
-        <w:rPr>
-          <w:highlight w:val="yellow"/>
-        </w:rPr>
-        <w:t>(conferir RG/CPF de todos e comprovantes de Manoel, Joel e Jailene)</w:t>
-      </w:r>
-    </w:p>
-    <w:p>
-      <w:pPr>
-        <w:spacing w:line="360" w:lineRule="auto" w:after="0"/>
-      </w:pPr>
-      <w:r>
-        <w:rPr/>
-        <w:t xml:space="preserve">[Doc. 08 – Certidões de nascimento dos filhos.] </w:t>
+        <w:t xml:space="preserve">[Doc. 07 – Certidões de nascimento dos filhos.] </w:t>
       </w:r>
       <w:r>
         <w:rPr>

</xml_diff>

<commit_message>
Habilitação de herdeiros: atualiza rol de documentos
Co-Authored-By: Claude Opus 5.5 <noreply@anthropic.com>
Claude-Session: https://claude.ai/code/session_01RSEcSvs1Px517d8mUYokdi
</commit_message>
<xml_diff>
--- a/0800122-42.2025 - Francisca Sousa/Habilitação de herdeiros - Francisca Sousa da Silva.docx
+++ b/0800122-42.2025 - Francisca Sousa/Habilitação de herdeiros - Francisca Sousa da Silva.docx
@@ -840,13 +840,13 @@
       </w:pPr>
       <w:r>
         <w:rPr/>
-        <w:t xml:space="preserve">[Doc. 06 – Documentos pessoais (RG e CPF) e comprovantes de residência dos requerentes;] </w:t>
+        <w:t xml:space="preserve">[Doc. 06 – Documentos de identidade dos requerentes;] </w:t>
       </w:r>
       <w:r>
         <w:rPr>
           <w:highlight w:val="yellow"/>
         </w:rPr>
-        <w:t>(conferir RG/CPF de todos e comprovantes de Manoel, Joel e Jailene)</w:t>
+        <w:t>(falta RG/CPF de Manoel)</w:t>
       </w:r>
     </w:p>
     <w:p>
@@ -855,13 +855,22 @@
       </w:pPr>
       <w:r>
         <w:rPr/>
-        <w:t xml:space="preserve">[Doc. 07 – Certidões de nascimento dos filhos.] </w:t>
+        <w:t xml:space="preserve">[Doc. 07 – Comprovantes de residência dos requerentes;] </w:t>
       </w:r>
       <w:r>
         <w:rPr>
           <w:highlight w:val="yellow"/>
         </w:rPr>
-        <w:t>(juntar, se disponíveis)</w:t>
+        <w:t>(falta comprovante da Rua Picos, nº 506 – Manoel e Joel)</w:t>
+      </w:r>
+    </w:p>
+    <w:p>
+      <w:pPr>
+        <w:spacing w:line="360" w:lineRule="auto" w:after="0"/>
+      </w:pPr>
+      <w:r>
+        <w:rPr/>
+        <w:t>[Doc. 08 – Certidões de nascimento de Janaína, Joel Carlos e Gean Carlos.]</w:t>
       </w:r>
     </w:p>
     <w:p/>

</xml_diff>

<commit_message>
Habilitação de herdeiros: inclui comprovante de residência da Rua Picos
Co-Authored-By: Claude Opus 5.5 <noreply@anthropic.com>
Claude-Session: https://claude.ai/code/session_01RSEcSvs1Px517d8mUYokdi
</commit_message>
<xml_diff>
--- a/0800122-42.2025 - Francisca Sousa/Habilitação de herdeiros - Francisca Sousa da Silva.docx
+++ b/0800122-42.2025 - Francisca Sousa/Habilitação de herdeiros - Francisca Sousa da Silva.docx
@@ -855,13 +855,7 @@
       </w:pPr>
       <w:r>
         <w:rPr/>
-        <w:t xml:space="preserve">[Doc. 07 – Comprovantes de residência dos requerentes;] </w:t>
-      </w:r>
-      <w:r>
-        <w:rPr>
-          <w:highlight w:val="yellow"/>
-        </w:rPr>
-        <w:t>(falta comprovante da Rua Picos, nº 506 – Manoel e Joel)</w:t>
+        <w:t>[Doc. 07 – Comprovantes de residência dos requerentes (o imóvel da Rua Picos, nº 506, residência de Manoel e Joel, tem conta de energia ainda em nome da falecida);]</w:t>
       </w:r>
     </w:p>
     <w:p>

</xml_diff>

<commit_message>
Habilitação de herdeiros: inclui RG de Manoel e comprovante em seu nome
Co-Authored-By: Claude Opus 5.5 <noreply@anthropic.com>
Claude-Session: https://claude.ai/code/session_01RSEcSvs1Px517d8mUYokdi
</commit_message>
<xml_diff>
--- a/0800122-42.2025 - Francisca Sousa/Habilitação de herdeiros - Francisca Sousa da Silva.docx
+++ b/0800122-42.2025 - Francisca Sousa/Habilitação de herdeiros - Francisca Sousa da Silva.docx
@@ -50,7 +50,7 @@
       </w:r>
       <w:r>
         <w:rPr/>
-        <w:t xml:space="preserve">, brasileiro, viúvo, lavrador, nascido em 21/05/1954, natural de Miguel Alves/PI, inscrito no CPF sob o nº 606.865.573-36, residente e domiciliado na Rua Picos, nº 506, bairro São Miguel, Miguel Alves/PI, CEP 64.130-000; </w:t>
+        <w:t xml:space="preserve">, brasileiro, viúvo, lavrador, nascido em 21/05/1954, natural de Miguel Alves/PI, portador do RG nº 1.009.340 SSP/PI, inscrito no CPF sob o nº 606.865.573-36, residente e domiciliado na Rua Picos, nº 506, bairro São Miguel, Miguel Alves/PI, CEP 64.130-000; </w:t>
       </w:r>
       <w:r>
         <w:rPr>
@@ -840,13 +840,7 @@
       </w:pPr>
       <w:r>
         <w:rPr/>
-        <w:t xml:space="preserve">[Doc. 06 – Documentos de identidade dos requerentes;] </w:t>
-      </w:r>
-      <w:r>
-        <w:rPr>
-          <w:highlight w:val="yellow"/>
-        </w:rPr>
-        <w:t>(falta RG/CPF de Manoel)</w:t>
+        <w:t>[Doc. 06 – Documentos de identidade dos requerentes;]</w:t>
       </w:r>
     </w:p>
     <w:p>
@@ -855,7 +849,7 @@
       </w:pPr>
       <w:r>
         <w:rPr/>
-        <w:t>[Doc. 07 – Comprovantes de residência dos requerentes (o imóvel da Rua Picos, nº 506, residência de Manoel e Joel, tem conta de energia ainda em nome da falecida);]</w:t>
+        <w:t>[Doc. 07 – Comprovantes de residência dos requerentes (Rua Picos, nº 506: conta de água em nome de Manoel Lopes da Silva, residência também de Joel Carlos);]</w:t>
       </w:r>
     </w:p>
     <w:p>

</xml_diff>

<commit_message>
Habilitação de herdeiros: inexistência de inventário e testamento, dispensa de inventário para o levantamento e data de nascimento de Joel
Co-Authored-By: Claude Opus 5.5 <noreply@anthropic.com>
Claude-Session: https://claude.ai/code/session_01RSEcSvs1Px517d8mUYokdi
</commit_message>
<xml_diff>
--- a/0800122-42.2025 - Francisca Sousa/Habilitação de herdeiros - Francisca Sousa da Silva.docx
+++ b/0800122-42.2025 - Francisca Sousa/Habilitação de herdeiros - Francisca Sousa da Silva.docx
@@ -70,7 +70,7 @@
       </w:r>
       <w:r>
         <w:rPr/>
-        <w:t xml:space="preserve">, brasileiro, solteiro, lavrador, nascido em 29/12/1984, natural de Miguel Alves/PI, inscrito no CPF sob o nº 040.697.193-50, residente e domiciliado na Rua Picos, nº 506, bairro São Miguel, Miguel Alves/PI, CEP 64.130-000; </w:t>
+        <w:t xml:space="preserve">, brasileiro, solteiro, lavrador, nascido em 29/10/1984, natural de Miguel Alves/PI, inscrito no CPF sob o nº 040.697.193-50, residente e domiciliado na Rua Picos, nº 506, bairro São Miguel, Miguel Alves/PI, CEP 64.130-000; </w:t>
       </w:r>
       <w:r>
         <w:rPr>
@@ -263,13 +263,7 @@
       </w:pPr>
       <w:r>
         <w:rPr/>
-        <w:t xml:space="preserve">O crédito aqui executado, reconhecido por sentença transitada em julgado, tem natureza patrimonial e, por isso, transmitiu-se aos sucessores com a abertura da sucessão (art. 1.784 do Código Civil). </w:t>
-      </w:r>
-      <w:r>
-        <w:rPr>
-          <w:highlight w:val="yellow"/>
-        </w:rPr>
-        <w:t>Até a presente data não há inventário aberto nem testamento conhecido.</w:t>
+        <w:t>O crédito aqui executado, reconhecido por sentença transitada em julgado, tem natureza patrimonial e, por isso, transmitiu-se aos sucessores com a abertura da sucessão (art. 1.784 do Código Civil). A falecida não deixou testamento, e não há inventário ou arrolamento aberto.</w:t>
       </w:r>
     </w:p>
     <w:p>
@@ -517,60 +511,96 @@
         </w:rPr>
         <w:t>c.</w:t>
         <w:tab/>
-        <w:t>Da suspensão do processo e da restituição dos prazos:</w:t>
-      </w:r>
-    </w:p>
-    <w:p>
-      <w:pPr>
-        <w:spacing w:line="360" w:lineRule="auto" w:after="60"/>
-        <w:ind w:firstLine="850"/>
-        <w:jc w:val="both"/>
-      </w:pPr>
-      <w:r>
-        <w:rPr/>
-        <w:t xml:space="preserve">A morte da parte suspende o processo (art. 313, I, do CPC). Durante a suspensão, os prazos ficam suspensos e devem ser </w:t>
-      </w:r>
-      <w:r>
-        <w:rPr>
-          <w:b/>
-        </w:rPr>
-        <w:t>restituídos por tempo igual ao que faltava</w:t>
-      </w:r>
-      <w:r>
-        <w:rPr/>
-        <w:t xml:space="preserve"> para sua complementação (art. 221 do CPC).</w:t>
-      </w:r>
-    </w:p>
-    <w:p>
-      <w:pPr>
-        <w:spacing w:line="360" w:lineRule="auto" w:after="60"/>
-        <w:ind w:firstLine="850"/>
-        <w:jc w:val="both"/>
-      </w:pPr>
-      <w:r>
-        <w:rPr/>
-        <w:t>No caso, o óbito (16/07/2026) foi anterior à decisão de ID 102074323 (03/08/2026), à interposição do Agravo de Instrumento nº 0763031-67.2026.8.18.0000 e à decisão do Relator que determinou a intimação da agravada para contrarrazões (03/09/2026). Em razão do óbito, e com o mandato anterior extinto (art. 682, II, do CC), a exequente ficou sem representação a partir de 16/07/2026.</w:t>
-      </w:r>
-    </w:p>
-    <w:p>
-      <w:pPr>
-        <w:spacing w:line="360" w:lineRule="auto" w:after="60"/>
-        <w:ind w:firstLine="850"/>
-        <w:jc w:val="both"/>
-      </w:pPr>
-      <w:r>
-        <w:rPr/>
-        <w:t xml:space="preserve">Por isso, requer-se que se reconheça a suspensão do feito desde a data do óbito e que, deferida a habilitação, </w:t>
-      </w:r>
-      <w:r>
-        <w:rPr>
-          <w:b/>
-        </w:rPr>
-        <w:t>os prazos em curso sejam restituídos aos sucessores</w:t>
-      </w:r>
-      <w:r>
-        <w:rPr/>
-        <w:t>, em especial o prazo para contrarrazões ao agravo de instrumento. Requer-se, ainda, que o Egrégio TJPI seja comunicado para regularizar o polo passivo do recurso.</w:t>
+        <w:t>Da inexistência de inventário e testamento e da desnecessidade de inventário para o levantamento dos valores:</w:t>
+      </w:r>
+    </w:p>
+    <w:p>
+      <w:pPr>
+        <w:spacing w:line="360" w:lineRule="auto" w:after="60"/>
+        <w:ind w:firstLine="850"/>
+        <w:jc w:val="both"/>
+      </w:pPr>
+      <w:r>
+        <w:rPr/>
+        <w:t>A falecida não deixou testamento, e não há inventário ou arrolamento aberto. Os requerentes são os únicos sucessores, todos maiores e capazes, e estão de acordo quanto à divisão do crédito. [Doc. 05]</w:t>
+      </w:r>
+    </w:p>
+    <w:p>
+      <w:pPr>
+        <w:spacing w:line="360" w:lineRule="auto" w:after="60"/>
+        <w:ind w:firstLine="850"/>
+        <w:jc w:val="both"/>
+      </w:pPr>
+      <w:r>
+        <w:rPr/>
+        <w:t>Nessas condições, o inventário não é necessário para que os sucessores recebam o crédito aqui executado. Pelo princípio da saisine, a herança se transmite aos herdeiros no exato momento do óbito (art. 1.784 do CC). O art. 110 do CPC, por sua vez, admite expressamente a sucessão processual diretamente pelos sucessores, sem a figura do espólio.</w:t>
+      </w:r>
+    </w:p>
+    <w:p>
+      <w:pPr>
+        <w:spacing w:line="360" w:lineRule="auto" w:after="60"/>
+        <w:ind w:firstLine="850"/>
+        <w:jc w:val="both"/>
+      </w:pPr>
+      <w:r>
+        <w:rPr/>
+        <w:t>Além disso, o crédito decorre da restituição de descontos indevidos feitos sobre o benefício previdenciário da falecida. Trata-se, na essência, de valores do benefício que ela deixou de receber em vida. Para valores dessa natureza, a lei dispensa expressamente o inventário:</w:t>
+      </w:r>
+    </w:p>
+    <w:p>
+      <w:pPr>
+        <w:spacing w:before="160" w:after="200" w:line="240" w:lineRule="auto"/>
+        <w:ind w:left="2270" w:right="570"/>
+        <w:jc w:val="both"/>
+      </w:pPr>
+      <w:r>
+        <w:rPr>
+          <w:sz w:val="18"/>
+        </w:rPr>
+        <w:t>Lei nº 8.213/1991, art. 112. O valor não recebido em vida pelo segurado só será pago aos seus dependentes habilitados à pensão por morte ou, na falta deles, aos seus sucessores na forma da lei civil, independentemente de inventário ou arrolamento.</w:t>
+      </w:r>
+    </w:p>
+    <w:p>
+      <w:pPr>
+        <w:spacing w:line="360" w:lineRule="auto" w:after="60"/>
+        <w:ind w:firstLine="850"/>
+        <w:jc w:val="both"/>
+      </w:pPr>
+      <w:r>
+        <w:rPr/>
+        <w:t>A mesma orientação está no art. 666 do CPC, segundo o qual independe de inventário ou arrolamento o pagamento dos valores previstos na Lei nº 6.858/1980.</w:t>
+      </w:r>
+    </w:p>
+    <w:p>
+      <w:pPr>
+        <w:spacing w:line="360" w:lineRule="auto" w:after="60"/>
+        <w:ind w:firstLine="850"/>
+        <w:jc w:val="both"/>
+      </w:pPr>
+      <w:r>
+        <w:rPr/>
+        <w:t>Exigir a abertura de inventário apenas para dividir um único crédito entre cinco sucessores que já estão de acordo imporia custo e demora desproporcionais a pessoas hipossuficientes, sem nenhum proveito para terceiros. Isso contrariaria a razoável duração do processo e a eficiência (arts. 4º e 8º do CPC). Eventuais outros bens deixados pela falecida não interferem neste crédito e serão tratados pelas vias próprias.</w:t>
+      </w:r>
+    </w:p>
+    <w:p>
+      <w:pPr>
+        <w:spacing w:line="360" w:lineRule="auto" w:after="60"/>
+        <w:ind w:firstLine="850"/>
+        <w:jc w:val="both"/>
+      </w:pPr>
+      <w:r>
+        <w:rPr/>
+        <w:t xml:space="preserve">Por isso, requer-se que se reconheça, desde já, que o </w:t>
+      </w:r>
+      <w:r>
+        <w:rPr>
+          <w:b/>
+        </w:rPr>
+        <w:t>futuro levantamento dos valores independe de inventário ou arrolamento</w:t>
+      </w:r>
+      <w:r>
+        <w:rPr/>
+        <w:t xml:space="preserve"> e deverá ser feito diretamente aos sucessores habilitados, na proporção de 50% ao cônjuge meeiro e 12,5% a cada filho.</w:t>
       </w:r>
     </w:p>
     <w:p>
@@ -585,6 +615,74 @@
         </w:rPr>
         <w:t>d.</w:t>
         <w:tab/>
+        <w:t>Da suspensão do processo e da restituição dos prazos:</w:t>
+      </w:r>
+    </w:p>
+    <w:p>
+      <w:pPr>
+        <w:spacing w:line="360" w:lineRule="auto" w:after="60"/>
+        <w:ind w:firstLine="850"/>
+        <w:jc w:val="both"/>
+      </w:pPr>
+      <w:r>
+        <w:rPr/>
+        <w:t xml:space="preserve">A morte da parte suspende o processo (art. 313, I, do CPC). Durante a suspensão, os prazos ficam suspensos e devem ser </w:t>
+      </w:r>
+      <w:r>
+        <w:rPr>
+          <w:b/>
+        </w:rPr>
+        <w:t>restituídos por tempo igual ao que faltava</w:t>
+      </w:r>
+      <w:r>
+        <w:rPr/>
+        <w:t xml:space="preserve"> para sua complementação (art. 221 do CPC).</w:t>
+      </w:r>
+    </w:p>
+    <w:p>
+      <w:pPr>
+        <w:spacing w:line="360" w:lineRule="auto" w:after="60"/>
+        <w:ind w:firstLine="850"/>
+        <w:jc w:val="both"/>
+      </w:pPr>
+      <w:r>
+        <w:rPr/>
+        <w:t>No caso, o óbito (16/07/2026) foi anterior à decisão de ID 102074323 (03/08/2026), à interposição do Agravo de Instrumento nº 0763031-67.2026.8.18.0000 e à decisão do Relator que determinou a intimação da agravada para contrarrazões (03/09/2026). Em razão do óbito, e com o mandato anterior extinto (art. 682, II, do CC), a exequente ficou sem representação a partir de 16/07/2026.</w:t>
+      </w:r>
+    </w:p>
+    <w:p>
+      <w:pPr>
+        <w:spacing w:line="360" w:lineRule="auto" w:after="60"/>
+        <w:ind w:firstLine="850"/>
+        <w:jc w:val="both"/>
+      </w:pPr>
+      <w:r>
+        <w:rPr/>
+        <w:t xml:space="preserve">Por isso, requer-se que se reconheça a suspensão do feito desde a data do óbito e que, deferida a habilitação, </w:t>
+      </w:r>
+      <w:r>
+        <w:rPr>
+          <w:b/>
+        </w:rPr>
+        <w:t>os prazos em curso sejam restituídos aos sucessores</w:t>
+      </w:r>
+      <w:r>
+        <w:rPr/>
+        <w:t>, em especial o prazo para contrarrazões ao agravo de instrumento. Requer-se, ainda, que o Egrégio TJPI seja comunicado para regularizar o polo passivo do recurso.</w:t>
+      </w:r>
+    </w:p>
+    <w:p>
+      <w:pPr>
+        <w:keepNext/>
+        <w:spacing w:before="240" w:after="160" w:line="360" w:lineRule="auto"/>
+        <w:ind w:left="700" w:hanging="400"/>
+      </w:pPr>
+      <w:r>
+        <w:rPr>
+          <w:b/>
+        </w:rPr>
+        <w:t>e.</w:t>
+        <w:tab/>
         <w:t>Da gratuidade da justiça:</w:t>
       </w:r>
     </w:p>
@@ -693,17 +791,17 @@
         <w:rPr/>
         <w:t>d)</w:t>
         <w:tab/>
-        <w:t xml:space="preserve">a concessão dos benefícios da </w:t>
-      </w:r>
-      <w:r>
-        <w:rPr>
-          <w:b/>
-        </w:rPr>
-        <w:t>justiça gratuita</w:t>
-      </w:r>
-      <w:r>
-        <w:rPr/>
-        <w:t xml:space="preserve"> a todos os requerentes (arts. 98 e 99 do CPC);</w:t>
+        <w:t xml:space="preserve">o reconhecimento de que a falecida não deixou testamento nem há inventário aberto e de que o </w:t>
+      </w:r>
+      <w:r>
+        <w:rPr>
+          <w:b/>
+        </w:rPr>
+        <w:t>futuro levantamento dos valores independe de inventário ou arrolamento</w:t>
+      </w:r>
+      <w:r>
+        <w:rPr/>
+        <w:t>, devendo ser feito diretamente aos sucessores habilitados, na proporção de 50% ao cônjuge meeiro e 12,5% a cada filho (art. 1.784 do CC; art. 112 da Lei nº 8.213/1991; art. 666 do CPC);</w:t>
       </w:r>
     </w:p>
     <w:p>
@@ -716,17 +814,17 @@
         <w:rPr/>
         <w:t>e)</w:t>
         <w:tab/>
-        <w:t xml:space="preserve">o reconhecimento de que os prazos em curso ficaram suspensos desde o óbito, com sua </w:t>
-      </w:r>
-      <w:r>
-        <w:rPr>
-          <w:b/>
-        </w:rPr>
-        <w:t>restituição integral aos sucessores</w:t>
-      </w:r>
-      <w:r>
-        <w:rPr/>
-        <w:t xml:space="preserve"> após a habilitação (art. 221 do CPC);</w:t>
+        <w:t xml:space="preserve">a concessão dos benefícios da </w:t>
+      </w:r>
+      <w:r>
+        <w:rPr>
+          <w:b/>
+        </w:rPr>
+        <w:t>justiça gratuita</w:t>
+      </w:r>
+      <w:r>
+        <w:rPr/>
+        <w:t xml:space="preserve"> a todos os requerentes (arts. 98 e 99 do CPC);</w:t>
       </w:r>
     </w:p>
     <w:p>
@@ -739,17 +837,17 @@
         <w:rPr/>
         <w:t>f)</w:t>
         <w:tab/>
-        <w:t xml:space="preserve">a comunicação da presente habilitação ao Excelentíssimo Desembargador Relator do </w:t>
-      </w:r>
-      <w:r>
-        <w:rPr>
-          <w:b/>
-        </w:rPr>
-        <w:t>Agravo de Instrumento nº 0763031-67.2026.8.18.0000</w:t>
-      </w:r>
-      <w:r>
-        <w:rPr/>
-        <w:t>, para regularização do polo passivo do recurso e restituição do prazo para contrarrazões;</w:t>
+        <w:t xml:space="preserve">o reconhecimento de que os prazos em curso ficaram suspensos desde o óbito, com sua </w:t>
+      </w:r>
+      <w:r>
+        <w:rPr>
+          <w:b/>
+        </w:rPr>
+        <w:t>restituição integral aos sucessores</w:t>
+      </w:r>
+      <w:r>
+        <w:rPr/>
+        <w:t xml:space="preserve"> após a habilitação (art. 221 do CPC);</w:t>
       </w:r>
     </w:p>
     <w:p>
@@ -761,6 +859,29 @@
       <w:r>
         <w:rPr/>
         <w:t>g)</w:t>
+        <w:tab/>
+        <w:t xml:space="preserve">a comunicação da presente habilitação ao Excelentíssimo Desembargador Relator do </w:t>
+      </w:r>
+      <w:r>
+        <w:rPr>
+          <w:b/>
+        </w:rPr>
+        <w:t>Agravo de Instrumento nº 0763031-67.2026.8.18.0000</w:t>
+      </w:r>
+      <w:r>
+        <w:rPr/>
+        <w:t>, para regularização do polo passivo do recurso e restituição do prazo para contrarrazões;</w:t>
+      </w:r>
+    </w:p>
+    <w:p>
+      <w:pPr>
+        <w:spacing w:line="360" w:lineRule="auto" w:after="120"/>
+        <w:ind w:left="1134" w:hanging="567"/>
+        <w:jc w:val="both"/>
+      </w:pPr>
+      <w:r>
+        <w:rPr/>
+        <w:t>h)</w:t>
         <w:tab/>
         <w:t>que todas as intimações sejam feitas em nome do advogado ANTÔNIO DE PÁDUA SANTOS NETO, OAB/PI 21.320, sob pena de nulidade.</w:t>
       </w:r>

</xml_diff>

<commit_message>
Habilitação de herdeiros: tópico sobre o falecimento da exequente sem receber o crédito e prioridade de tramitação
Co-Authored-By: Claude Opus 5.5 <noreply@anthropic.com>
Claude-Session: https://claude.ai/code/session_01RSEcSvs1Px517d8mUYokdi
</commit_message>
<xml_diff>
--- a/0800122-42.2025 - Francisca Sousa/Habilitação de herdeiros - Francisca Sousa da Silva.docx
+++ b/0800122-42.2025 - Francisca Sousa/Habilitação de herdeiros - Francisca Sousa da Silva.docx
@@ -288,6 +288,92 @@
         </w:rPr>
         <w:t>II.</w:t>
         <w:tab/>
+        <w:t>DA EXEQUENTE QUE NÃO VIVEU PARA RECEBER O QUE LHE ERA DEVIDO</w:t>
+      </w:r>
+    </w:p>
+    <w:p>
+      <w:pPr>
+        <w:spacing w:line="360" w:lineRule="auto" w:after="60"/>
+        <w:ind w:firstLine="850"/>
+        <w:jc w:val="both"/>
+      </w:pPr>
+      <w:r>
+        <w:rPr/>
+        <w:t>Antes de tratar do direito, é preciso registrar, com pesar, o que este processo representou para a Sra. Francisca.</w:t>
+      </w:r>
+    </w:p>
+    <w:p>
+      <w:pPr>
+        <w:spacing w:line="360" w:lineRule="auto" w:after="60"/>
+        <w:ind w:firstLine="850"/>
+        <w:jc w:val="both"/>
+      </w:pPr>
+      <w:r>
+        <w:rPr/>
+        <w:t>Aposentada, idosa e em tratamento contra o câncer, ela teve seu benefício previdenciário de R$ 1.518,00 reduzido, mês após mês, por descontos de R$ 424,00 referentes a dois empréstimos que nunca contratou. Foram mais de dois anos e meio, de novembro de 2022 a junho de 2025, com quase 30% de sua única renda retida pelo banco, justamente no período em que mais precisava dela para custear medicamentos, exames e o próprio sustento.</w:t>
+      </w:r>
+    </w:p>
+    <w:p>
+      <w:pPr>
+        <w:spacing w:line="360" w:lineRule="auto" w:after="60"/>
+        <w:ind w:firstLine="850"/>
+        <w:jc w:val="both"/>
+      </w:pPr>
+      <w:r>
+        <w:rPr/>
+        <w:t>Para provar que não havia recebido o dinheiro dos empréstimos, a autora, com mobilidade reduzida e em plena luta contra a doença, ainda precisou ir pessoalmente à agência do Banco do Brasil buscar a declaração de que a conta indicada pelo réu sequer existia em seu nome (ID 76604921).</w:t>
+      </w:r>
+    </w:p>
+    <w:p>
+      <w:pPr>
+        <w:spacing w:line="360" w:lineRule="auto" w:after="60"/>
+        <w:ind w:firstLine="850"/>
+        <w:jc w:val="both"/>
+      </w:pPr>
+      <w:r>
+        <w:rPr/>
+        <w:t>Ela venceu a ação. A sentença transitou em julgado em 08/12/2025, e o cumprimento de sentença foi iniciado em 31/03/2026. Mesmo assim, o banco não pagou. Apresentou impugnação baseada em supostos “estornos” que nunca chegaram às mãos da autora, tese que este Juízo qualificou como “manifestamente protelatória” (ID 98976248). Com isso, o dinheiro continuou depositado em juízo, fora do alcance de quem tinha direito a ele.</w:t>
+      </w:r>
+    </w:p>
+    <w:p>
+      <w:pPr>
+        <w:spacing w:line="360" w:lineRule="auto" w:after="60"/>
+        <w:ind w:firstLine="850"/>
+        <w:jc w:val="both"/>
+      </w:pPr>
+      <w:r>
+        <w:rPr/>
+        <w:t xml:space="preserve">Em 16/07/2026, menos de um mês depois da rejeição da impugnação, a Sra. Francisca faleceu, aos 72 anos, em decorrência de complicações do mieloma múltiplo contra o qual lutava (Doc. 01). </w:t>
+      </w:r>
+      <w:r>
+        <w:rPr>
+          <w:b/>
+        </w:rPr>
+        <w:t>Morreu sem receber um único centavo do que o Poder Judiciário lhe havia reconhecido.</w:t>
+      </w:r>
+    </w:p>
+    <w:p>
+      <w:pPr>
+        <w:spacing w:line="360" w:lineRule="auto" w:after="60"/>
+        <w:ind w:firstLine="850"/>
+        <w:jc w:val="both"/>
+      </w:pPr>
+      <w:r>
+        <w:rPr/>
+        <w:t>Os sucessores lamentam profundamente que ela não tenha podido usar esses recursos no período em que deles mais precisou. Este registro não tem o propósito de comover. Seu objetivo é deixar claro o custo humano da resistência injustificada do executado, circunstância que deve ser considerada por este Juízo na apreciação da conduta processual do banco (arts. 77, 80 e 774 do CPC) e que justifica a máxima celeridade na tramitação do feito daqui em diante.</w:t>
+      </w:r>
+    </w:p>
+    <w:p>
+      <w:pPr>
+        <w:keepNext/>
+        <w:spacing w:before="360" w:after="240" w:line="360" w:lineRule="auto"/>
+      </w:pPr>
+      <w:r>
+        <w:rPr>
+          <w:b/>
+        </w:rPr>
+        <w:t>III.</w:t>
+        <w:tab/>
         <w:t>DO DIREITO</w:t>
       </w:r>
     </w:p>
@@ -700,13 +786,39 @@
     <w:p>
       <w:pPr>
         <w:keepNext/>
+        <w:spacing w:before="240" w:after="160" w:line="360" w:lineRule="auto"/>
+        <w:ind w:left="700" w:hanging="400"/>
+      </w:pPr>
+      <w:r>
+        <w:rPr>
+          <w:b/>
+        </w:rPr>
+        <w:t>f.</w:t>
+        <w:tab/>
+        <w:t>Da prioridade de tramitação:</w:t>
+      </w:r>
+    </w:p>
+    <w:p>
+      <w:pPr>
+        <w:spacing w:line="360" w:lineRule="auto" w:after="60"/>
+        <w:ind w:firstLine="850"/>
+        <w:jc w:val="both"/>
+      </w:pPr>
+      <w:r>
+        <w:rPr/>
+        <w:t>A exequente tinha direito à prioridade de tramitação, por ser idosa e portadora de doença grave (art. 1.048, I, do CPC). Essa prioridade não cessa com a morte e se estende ao cônjuge sobrevivente (art. 1.048, § 3º, do CPC, e art. 71, § 2º, da Lei nº 10.741/2003). Além disso, o requerente Manoel Lopes da Silva tem 72 anos e faz jus ao benefício por direito próprio (art. 1.048, I, do CPC).</w:t>
+      </w:r>
+    </w:p>
+    <w:p>
+      <w:pPr>
+        <w:keepNext/>
         <w:spacing w:before="360" w:after="240" w:line="360" w:lineRule="auto"/>
       </w:pPr>
       <w:r>
         <w:rPr>
           <w:b/>
         </w:rPr>
-        <w:t>III.</w:t>
+        <w:t>IV.</w:t>
         <w:tab/>
         <w:t>DOS PEDIDOS</w:t>
       </w:r>
@@ -837,17 +949,17 @@
         <w:rPr/>
         <w:t>f)</w:t>
         <w:tab/>
-        <w:t xml:space="preserve">o reconhecimento de que os prazos em curso ficaram suspensos desde o óbito, com sua </w:t>
-      </w:r>
-      <w:r>
-        <w:rPr>
-          <w:b/>
-        </w:rPr>
-        <w:t>restituição integral aos sucessores</w:t>
-      </w:r>
-      <w:r>
-        <w:rPr/>
-        <w:t xml:space="preserve"> após a habilitação (art. 221 do CPC);</w:t>
+        <w:t xml:space="preserve">a concessão ou manutenção da </w:t>
+      </w:r>
+      <w:r>
+        <w:rPr>
+          <w:b/>
+        </w:rPr>
+        <w:t>prioridade de tramitação</w:t>
+      </w:r>
+      <w:r>
+        <w:rPr/>
+        <w:t xml:space="preserve"> (art. 1.048, I e § 3º, do CPC; art. 71, § 2º, da Lei nº 10.741/2003);</w:t>
       </w:r>
     </w:p>
     <w:p>
@@ -860,17 +972,17 @@
         <w:rPr/>
         <w:t>g)</w:t>
         <w:tab/>
-        <w:t xml:space="preserve">a comunicação da presente habilitação ao Excelentíssimo Desembargador Relator do </w:t>
-      </w:r>
-      <w:r>
-        <w:rPr>
-          <w:b/>
-        </w:rPr>
-        <w:t>Agravo de Instrumento nº 0763031-67.2026.8.18.0000</w:t>
-      </w:r>
-      <w:r>
-        <w:rPr/>
-        <w:t>, para regularização do polo passivo do recurso e restituição do prazo para contrarrazões;</w:t>
+        <w:t xml:space="preserve">o reconhecimento de que os prazos em curso ficaram suspensos desde o óbito, com sua </w:t>
+      </w:r>
+      <w:r>
+        <w:rPr>
+          <w:b/>
+        </w:rPr>
+        <w:t>restituição integral aos sucessores</w:t>
+      </w:r>
+      <w:r>
+        <w:rPr/>
+        <w:t xml:space="preserve"> após a habilitação (art. 221 do CPC);</w:t>
       </w:r>
     </w:p>
     <w:p>
@@ -882,6 +994,29 @@
       <w:r>
         <w:rPr/>
         <w:t>h)</w:t>
+        <w:tab/>
+        <w:t xml:space="preserve">a comunicação da presente habilitação ao Excelentíssimo Desembargador Relator do </w:t>
+      </w:r>
+      <w:r>
+        <w:rPr>
+          <w:b/>
+        </w:rPr>
+        <w:t>Agravo de Instrumento nº 0763031-67.2026.8.18.0000</w:t>
+      </w:r>
+      <w:r>
+        <w:rPr/>
+        <w:t>, para regularização do polo passivo do recurso e restituição do prazo para contrarrazões;</w:t>
+      </w:r>
+    </w:p>
+    <w:p>
+      <w:pPr>
+        <w:spacing w:line="360" w:lineRule="auto" w:after="120"/>
+        <w:ind w:left="1134" w:hanging="567"/>
+        <w:jc w:val="both"/>
+      </w:pPr>
+      <w:r>
+        <w:rPr/>
+        <w:t>i)</w:t>
         <w:tab/>
         <w:t>que todas as intimações sejam feitas em nome do advogado ANTÔNIO DE PÁDUA SANTOS NETO, OAB/PI 21.320, sob pena de nulidade.</w:t>
       </w:r>

</xml_diff>

<commit_message>
Habilitação de herdeiros: fonte Lora Medium e formatação padrão do escritório
Co-Authored-By: Claude Opus 5.5 <noreply@anthropic.com>
Claude-Session: https://claude.ai/code/session_01RSEcSvs1Px517d8mUYokdi
</commit_message>
<xml_diff>
--- a/0800122-42.2025 - Francisca Sousa/Habilitação de herdeiros - Francisca Sousa da Silva.docx
+++ b/0800122-42.2025 - Francisca Sousa/Habilitação de herdeiros - Francisca Sousa da Silva.docx
@@ -9,6 +9,7 @@
       </w:pPr>
       <w:r>
         <w:rPr>
+          <w:rFonts w:ascii="Lora Medium" w:hAnsi="Lora Medium" w:cs="Lora Medium" w:eastAsia="Lora Medium"/>
           <w:b/>
         </w:rPr>
         <w:t>EXCELENTÍSSIMO SENHOR DOUTOR JUIZ DE DIREITO DA VARA ÚNICA DA COMARCA DE MIGUEL ALVES-PI.</w:t>
@@ -21,6 +22,7 @@
       </w:pPr>
       <w:r>
         <w:rPr>
+          <w:rFonts w:ascii="Lora Medium" w:hAnsi="Lora Medium" w:cs="Lora Medium" w:eastAsia="Lora Medium"/>
           <w:b/>
         </w:rPr>
         <w:t>Processo nº 0800122-42.2025.8.18.0061</w:t>
@@ -31,7 +33,9 @@
         <w:spacing w:line="360" w:lineRule="auto" w:after="60"/>
       </w:pPr>
       <w:r>
-        <w:rPr/>
+        <w:rPr>
+          <w:rFonts w:ascii="Lora Medium" w:hAnsi="Lora Medium" w:cs="Lora Medium" w:eastAsia="Lora Medium"/>
+        </w:rPr>
         <w:t>Cumprimento de sentença – Exequente: FRANCISCA SOUSA DA SILVA (falecida) – Executado: BANCO PAN S.A.</w:t>
       </w:r>
     </w:p>
@@ -44,62 +48,80 @@
       </w:pPr>
       <w:r>
         <w:rPr>
+          <w:rFonts w:ascii="Lora Medium" w:hAnsi="Lora Medium" w:cs="Lora Medium" w:eastAsia="Lora Medium"/>
           <w:b/>
         </w:rPr>
         <w:t>MANOEL LOPES DA SILVA</w:t>
       </w:r>
       <w:r>
-        <w:rPr/>
+        <w:rPr>
+          <w:rFonts w:ascii="Lora Medium" w:hAnsi="Lora Medium" w:cs="Lora Medium" w:eastAsia="Lora Medium"/>
+        </w:rPr>
         <w:t xml:space="preserve">, brasileiro, viúvo, lavrador, nascido em 21/05/1954, natural de Miguel Alves/PI, portador do RG nº 1.009.340 SSP/PI, inscrito no CPF sob o nº 606.865.573-36, residente e domiciliado na Rua Picos, nº 506, bairro São Miguel, Miguel Alves/PI, CEP 64.130-000; </w:t>
       </w:r>
       <w:r>
         <w:rPr>
+          <w:rFonts w:ascii="Lora Medium" w:hAnsi="Lora Medium" w:cs="Lora Medium" w:eastAsia="Lora Medium"/>
           <w:b/>
         </w:rPr>
         <w:t>JAILENE SOUSA SILVA RODRIGUES</w:t>
       </w:r>
       <w:r>
-        <w:rPr/>
+        <w:rPr>
+          <w:rFonts w:ascii="Lora Medium" w:hAnsi="Lora Medium" w:cs="Lora Medium" w:eastAsia="Lora Medium"/>
+        </w:rPr>
         <w:t xml:space="preserve">, brasileira, casada, lavradora, nascida em 14/10/1982, natural de Miguel Alves/PI, inscrita no CPF sob o nº 924.859.953-20, residente e domiciliada no Residencial Helena, Quadra C, casa 17, bairro São Sebastião, União/PI, CEP 64.120-000; </w:t>
       </w:r>
       <w:r>
         <w:rPr>
+          <w:rFonts w:ascii="Lora Medium" w:hAnsi="Lora Medium" w:cs="Lora Medium" w:eastAsia="Lora Medium"/>
           <w:b/>
         </w:rPr>
         <w:t>JOEL CARLOS SOUSA SILVA</w:t>
       </w:r>
       <w:r>
-        <w:rPr/>
+        <w:rPr>
+          <w:rFonts w:ascii="Lora Medium" w:hAnsi="Lora Medium" w:cs="Lora Medium" w:eastAsia="Lora Medium"/>
+        </w:rPr>
         <w:t xml:space="preserve">, brasileiro, solteiro, lavrador, nascido em 29/10/1984, natural de Miguel Alves/PI, inscrito no CPF sob o nº 040.697.193-50, residente e domiciliado na Rua Picos, nº 506, bairro São Miguel, Miguel Alves/PI, CEP 64.130-000; </w:t>
       </w:r>
       <w:r>
         <w:rPr>
+          <w:rFonts w:ascii="Lora Medium" w:hAnsi="Lora Medium" w:cs="Lora Medium" w:eastAsia="Lora Medium"/>
           <w:b/>
         </w:rPr>
         <w:t>GEAN CARLOS SOUSA SILVA</w:t>
       </w:r>
       <w:r>
-        <w:rPr/>
+        <w:rPr>
+          <w:rFonts w:ascii="Lora Medium" w:hAnsi="Lora Medium" w:cs="Lora Medium" w:eastAsia="Lora Medium"/>
+        </w:rPr>
         <w:t xml:space="preserve">, brasileiro, solteiro, lavrador, nascido em 15/11/1980, natural de Miguel Alves/PI, inscrito no CPF sob o nº 005.917.433-10, residente e domiciliado no Povoado Estirões, s/n, zona rural, Miguel Alves/PI, CEP 64.130-000; e </w:t>
       </w:r>
       <w:r>
         <w:rPr>
+          <w:rFonts w:ascii="Lora Medium" w:hAnsi="Lora Medium" w:cs="Lora Medium" w:eastAsia="Lora Medium"/>
           <w:b/>
         </w:rPr>
         <w:t>JANAÍNA DE SOUSA SILVA</w:t>
       </w:r>
       <w:r>
-        <w:rPr/>
+        <w:rPr>
+          <w:rFonts w:ascii="Lora Medium" w:hAnsi="Lora Medium" w:cs="Lora Medium" w:eastAsia="Lora Medium"/>
+        </w:rPr>
         <w:t xml:space="preserve">, brasileira, solteira, lavradora, nascida em 04/07/1988, natural de Miguel Alves/PI, portadora do RG nº 2.919.897 SSP/PI, inscrita no CPF sob o nº 022.156.843-30, residente e domiciliada na Rua Picos, nº 531, bairro São Miguel, Miguel Alves/PI, CEP 64.130-000, todos sem endereço eletrônico, na qualidade de cônjuge sobrevivente e filhos da exequente </w:t>
       </w:r>
       <w:r>
         <w:rPr>
+          <w:rFonts w:ascii="Lora Medium" w:hAnsi="Lora Medium" w:cs="Lora Medium" w:eastAsia="Lora Medium"/>
           <w:b/>
         </w:rPr>
         <w:t>FRANCISCA SOUSA DA SILVA</w:t>
       </w:r>
       <w:r>
-        <w:rPr/>
+        <w:rPr>
+          <w:rFonts w:ascii="Lora Medium" w:hAnsi="Lora Medium" w:cs="Lora Medium" w:eastAsia="Lora Medium"/>
+        </w:rPr>
         <w:t>, por intermédio de seu advogado infra-assinado (procurações anexas), vêm, respeitosamente, à presença de Vossa Excelência, com fundamento nos arts. 110, 313, I, e 687 a 692 do Código de Processo Civil, requerer a presente</w:t>
       </w:r>
     </w:p>
@@ -111,6 +133,7 @@
       </w:pPr>
       <w:r>
         <w:rPr>
+          <w:rFonts w:ascii="Lora Medium" w:hAnsi="Lora Medium" w:cs="Lora Medium" w:eastAsia="Lora Medium"/>
           <w:b/>
         </w:rPr>
         <w:t>HABILITAÇÃO DE HERDEIROS</w:t>
@@ -124,28 +147,41 @@
         <w:jc w:val="both"/>
       </w:pPr>
       <w:r>
-        <w:rPr/>
+        <w:rPr>
+          <w:rFonts w:ascii="Lora Medium" w:hAnsi="Lora Medium" w:cs="Lora Medium" w:eastAsia="Lora Medium"/>
+        </w:rPr>
         <w:t xml:space="preserve">em face de </w:t>
       </w:r>
       <w:r>
         <w:rPr>
+          <w:rFonts w:ascii="Lora Medium" w:hAnsi="Lora Medium" w:cs="Lora Medium" w:eastAsia="Lora Medium"/>
           <w:b/>
         </w:rPr>
         <w:t>BANCO PAN S.A.</w:t>
       </w:r>
       <w:r>
-        <w:rPr/>
+        <w:rPr>
+          <w:rFonts w:ascii="Lora Medium" w:hAnsi="Lora Medium" w:cs="Lora Medium" w:eastAsia="Lora Medium"/>
+        </w:rPr>
         <w:t>, já qualificado nos autos, pelas razões de fato e de direito a seguir expostas.</w:t>
       </w:r>
     </w:p>
     <w:p>
       <w:pPr>
         <w:keepNext/>
+        <w:tabs>
+          <w:tab w:pos="1000" w:val="left"/>
+        </w:tabs>
         <w:spacing w:before="360" w:after="240" w:line="360" w:lineRule="auto"/>
-      </w:pPr>
-      <w:r>
-        <w:rPr>
-          <w:b/>
+        <w:ind w:left="0"/>
+        <w:shd w:val="clear" w:color="auto" w:fill="123BB8"/>
+      </w:pPr>
+      <w:r>
+        <w:rPr>
+          <w:rFonts w:ascii="Lora Medium" w:hAnsi="Lora Medium" w:cs="Lora Medium" w:eastAsia="Lora Medium"/>
+          <w:b/>
+          <w:i/>
+          <w:color w:val="FFFFFF"/>
         </w:rPr>
         <w:t>I.</w:t>
         <w:tab/>
@@ -159,17 +195,24 @@
         <w:jc w:val="both"/>
       </w:pPr>
       <w:r>
-        <w:rPr/>
+        <w:rPr>
+          <w:rFonts w:ascii="Lora Medium" w:hAnsi="Lora Medium" w:cs="Lora Medium" w:eastAsia="Lora Medium"/>
+        </w:rPr>
         <w:t xml:space="preserve">A Sra. Francisca Sousa da Silva, autora da ação declaratória e exequente no presente cumprimento de sentença, </w:t>
       </w:r>
       <w:r>
         <w:rPr>
-          <w:b/>
+          <w:rFonts w:ascii="Lora Medium" w:hAnsi="Lora Medium" w:cs="Lora Medium" w:eastAsia="Lora Medium"/>
+          <w:b/>
+          <w:u w:val="single"/>
+          <w:shd w:val="clear" w:color="auto" w:fill="CFE2F3"/>
         </w:rPr>
         <w:t>faleceu em 16 de julho de 2026</w:t>
       </w:r>
       <w:r>
-        <w:rPr/>
+        <w:rPr>
+          <w:rFonts w:ascii="Lora Medium" w:hAnsi="Lora Medium" w:cs="Lora Medium" w:eastAsia="Lora Medium"/>
+        </w:rPr>
         <w:t>, no Hospital Pedro Vasconcelos, em Miguel Alves/PI, conforme certidão de óbito expedida pelo Cartório Único de Miguel Alves (matrícula 149435 01 55 2026 4 00011 230 0004980 09). [Doc. 01]</w:t>
       </w:r>
     </w:p>
@@ -180,27 +223,37 @@
         <w:jc w:val="both"/>
       </w:pPr>
       <w:r>
-        <w:rPr/>
+        <w:rPr>
+          <w:rFonts w:ascii="Lora Medium" w:hAnsi="Lora Medium" w:cs="Lora Medium" w:eastAsia="Lora Medium"/>
+        </w:rPr>
         <w:t xml:space="preserve">A falecida era casada com o requerente </w:t>
       </w:r>
       <w:r>
         <w:rPr>
+          <w:rFonts w:ascii="Lora Medium" w:hAnsi="Lora Medium" w:cs="Lora Medium" w:eastAsia="Lora Medium"/>
           <w:b/>
         </w:rPr>
         <w:t>Manoel Lopes da Silva</w:t>
       </w:r>
       <w:r>
-        <w:rPr/>
+        <w:rPr>
+          <w:rFonts w:ascii="Lora Medium" w:hAnsi="Lora Medium" w:cs="Lora Medium" w:eastAsia="Lora Medium"/>
+        </w:rPr>
         <w:t xml:space="preserve"> desde 15/09/1976, sob o regime da </w:t>
       </w:r>
       <w:r>
         <w:rPr>
-          <w:b/>
+          <w:rFonts w:ascii="Lora Medium" w:hAnsi="Lora Medium" w:cs="Lora Medium" w:eastAsia="Lora Medium"/>
+          <w:b/>
+          <w:u w:val="single"/>
+          <w:shd w:val="clear" w:color="auto" w:fill="CFE2F3"/>
         </w:rPr>
         <w:t>comunhão de bens</w:t>
       </w:r>
       <w:r>
-        <w:rPr/>
+        <w:rPr>
+          <w:rFonts w:ascii="Lora Medium" w:hAnsi="Lora Medium" w:cs="Lora Medium" w:eastAsia="Lora Medium"/>
+        </w:rPr>
         <w:t>, conforme certidão de casamento (matrícula 149435 01 55 1976 2 00013 191 0000054-85). [Doc. 02]</w:t>
       </w:r>
     </w:p>
@@ -211,47 +264,61 @@
         <w:jc w:val="both"/>
       </w:pPr>
       <w:r>
-        <w:rPr/>
+        <w:rPr>
+          <w:rFonts w:ascii="Lora Medium" w:hAnsi="Lora Medium" w:cs="Lora Medium" w:eastAsia="Lora Medium"/>
+        </w:rPr>
         <w:t xml:space="preserve">Da união nasceram quatro filhos, todos maiores e capazes, que figuram como requerentes: </w:t>
       </w:r>
       <w:r>
         <w:rPr>
+          <w:rFonts w:ascii="Lora Medium" w:hAnsi="Lora Medium" w:cs="Lora Medium" w:eastAsia="Lora Medium"/>
           <w:b/>
         </w:rPr>
         <w:t>Gean Carlos Sousa Silva</w:t>
       </w:r>
       <w:r>
-        <w:rPr/>
+        <w:rPr>
+          <w:rFonts w:ascii="Lora Medium" w:hAnsi="Lora Medium" w:cs="Lora Medium" w:eastAsia="Lora Medium"/>
+        </w:rPr>
         <w:t xml:space="preserve"> (45 anos), </w:t>
       </w:r>
       <w:r>
         <w:rPr>
+          <w:rFonts w:ascii="Lora Medium" w:hAnsi="Lora Medium" w:cs="Lora Medium" w:eastAsia="Lora Medium"/>
           <w:b/>
         </w:rPr>
         <w:t>Jailene Sousa Silva Rodrigues</w:t>
       </w:r>
       <w:r>
-        <w:rPr/>
+        <w:rPr>
+          <w:rFonts w:ascii="Lora Medium" w:hAnsi="Lora Medium" w:cs="Lora Medium" w:eastAsia="Lora Medium"/>
+        </w:rPr>
         <w:t xml:space="preserve"> (43 anos), </w:t>
       </w:r>
       <w:r>
         <w:rPr>
+          <w:rFonts w:ascii="Lora Medium" w:hAnsi="Lora Medium" w:cs="Lora Medium" w:eastAsia="Lora Medium"/>
           <w:b/>
         </w:rPr>
         <w:t>Joel Carlos Sousa Silva</w:t>
       </w:r>
       <w:r>
-        <w:rPr/>
+        <w:rPr>
+          <w:rFonts w:ascii="Lora Medium" w:hAnsi="Lora Medium" w:cs="Lora Medium" w:eastAsia="Lora Medium"/>
+        </w:rPr>
         <w:t xml:space="preserve"> (41 anos) e </w:t>
       </w:r>
       <w:r>
         <w:rPr>
+          <w:rFonts w:ascii="Lora Medium" w:hAnsi="Lora Medium" w:cs="Lora Medium" w:eastAsia="Lora Medium"/>
           <w:b/>
         </w:rPr>
         <w:t>Janaína de Sousa Silva</w:t>
       </w:r>
       <w:r>
-        <w:rPr/>
+        <w:rPr>
+          <w:rFonts w:ascii="Lora Medium" w:hAnsi="Lora Medium" w:cs="Lora Medium" w:eastAsia="Lora Medium"/>
+        </w:rPr>
         <w:t xml:space="preserve"> (38 anos), exatamente como consta do campo “existência de filhos” da certidão de óbito.</w:t>
       </w:r>
     </w:p>
@@ -262,7 +329,9 @@
         <w:jc w:val="both"/>
       </w:pPr>
       <w:r>
-        <w:rPr/>
+        <w:rPr>
+          <w:rFonts w:ascii="Lora Medium" w:hAnsi="Lora Medium" w:cs="Lora Medium" w:eastAsia="Lora Medium"/>
+        </w:rPr>
         <w:t>O crédito aqui executado, reconhecido por sentença transitada em julgado, tem natureza patrimonial e, por isso, transmitiu-se aos sucessores com a abertura da sucessão (art. 1.784 do Código Civil). A falecida não deixou testamento, e não há inventário ou arrolamento aberto.</w:t>
       </w:r>
     </w:p>
@@ -273,18 +342,28 @@
         <w:jc w:val="both"/>
       </w:pPr>
       <w:r>
-        <w:rPr/>
+        <w:rPr>
+          <w:rFonts w:ascii="Lora Medium" w:hAnsi="Lora Medium" w:cs="Lora Medium" w:eastAsia="Lora Medium"/>
+        </w:rPr>
         <w:t>Por fim, registra-se que o óbito ocorreu no curso do cumprimento de sentença, quando já pendiam a impugnação do executado e, em seguida, o Agravo de Instrumento nº 0763031-67.2026.8.18.0000, interposto pelo Banco Pan perante o Egrégio TJPI, no qual a falecida figura como agravada.</w:t>
       </w:r>
     </w:p>
     <w:p>
       <w:pPr>
         <w:keepNext/>
+        <w:tabs>
+          <w:tab w:pos="1000" w:val="left"/>
+        </w:tabs>
         <w:spacing w:before="360" w:after="240" w:line="360" w:lineRule="auto"/>
-      </w:pPr>
-      <w:r>
-        <w:rPr>
-          <w:b/>
+        <w:ind w:left="0"/>
+        <w:shd w:val="clear" w:color="auto" w:fill="123BB8"/>
+      </w:pPr>
+      <w:r>
+        <w:rPr>
+          <w:rFonts w:ascii="Lora Medium" w:hAnsi="Lora Medium" w:cs="Lora Medium" w:eastAsia="Lora Medium"/>
+          <w:b/>
+          <w:i/>
+          <w:color w:val="FFFFFF"/>
         </w:rPr>
         <w:t>II.</w:t>
         <w:tab/>
@@ -298,7 +377,9 @@
         <w:jc w:val="both"/>
       </w:pPr>
       <w:r>
-        <w:rPr/>
+        <w:rPr>
+          <w:rFonts w:ascii="Lora Medium" w:hAnsi="Lora Medium" w:cs="Lora Medium" w:eastAsia="Lora Medium"/>
+        </w:rPr>
         <w:t>Antes de tratar do direito, é preciso registrar, com pesar, o que este processo representou para a Sra. Francisca.</w:t>
       </w:r>
     </w:p>
@@ -309,7 +390,9 @@
         <w:jc w:val="both"/>
       </w:pPr>
       <w:r>
-        <w:rPr/>
+        <w:rPr>
+          <w:rFonts w:ascii="Lora Medium" w:hAnsi="Lora Medium" w:cs="Lora Medium" w:eastAsia="Lora Medium"/>
+        </w:rPr>
         <w:t>Aposentada, idosa e em tratamento contra o câncer, ela teve seu benefício previdenciário de R$ 1.518,00 reduzido, mês após mês, por descontos de R$ 424,00 referentes a dois empréstimos que nunca contratou. Foram mais de dois anos e meio, de novembro de 2022 a junho de 2025, com quase 30% de sua única renda retida pelo banco, justamente no período em que mais precisava dela para custear medicamentos, exames e o próprio sustento.</w:t>
       </w:r>
     </w:p>
@@ -320,7 +403,9 @@
         <w:jc w:val="both"/>
       </w:pPr>
       <w:r>
-        <w:rPr/>
+        <w:rPr>
+          <w:rFonts w:ascii="Lora Medium" w:hAnsi="Lora Medium" w:cs="Lora Medium" w:eastAsia="Lora Medium"/>
+        </w:rPr>
         <w:t>Para provar que não havia recebido o dinheiro dos empréstimos, a autora, com mobilidade reduzida e em plena luta contra a doença, ainda precisou ir pessoalmente à agência do Banco do Brasil buscar a declaração de que a conta indicada pelo réu sequer existia em seu nome (ID 76604921).</w:t>
       </w:r>
     </w:p>
@@ -331,7 +416,9 @@
         <w:jc w:val="both"/>
       </w:pPr>
       <w:r>
-        <w:rPr/>
+        <w:rPr>
+          <w:rFonts w:ascii="Lora Medium" w:hAnsi="Lora Medium" w:cs="Lora Medium" w:eastAsia="Lora Medium"/>
+        </w:rPr>
         <w:t>Ela venceu a ação. A sentença transitou em julgado em 08/12/2025, e o cumprimento de sentença foi iniciado em 31/03/2026. Mesmo assim, o banco não pagou. Apresentou impugnação baseada em supostos “estornos” que nunca chegaram às mãos da autora, tese que este Juízo qualificou como “manifestamente protelatória” (ID 98976248). Com isso, o dinheiro continuou depositado em juízo, fora do alcance de quem tinha direito a ele.</w:t>
       </w:r>
     </w:p>
@@ -342,12 +429,17 @@
         <w:jc w:val="both"/>
       </w:pPr>
       <w:r>
-        <w:rPr/>
+        <w:rPr>
+          <w:rFonts w:ascii="Lora Medium" w:hAnsi="Lora Medium" w:cs="Lora Medium" w:eastAsia="Lora Medium"/>
+        </w:rPr>
         <w:t xml:space="preserve">Em 16/07/2026, menos de um mês depois da rejeição da impugnação, a Sra. Francisca faleceu, aos 72 anos, em decorrência de complicações do mieloma múltiplo contra o qual lutava (Doc. 01). </w:t>
       </w:r>
       <w:r>
         <w:rPr>
-          <w:b/>
+          <w:rFonts w:ascii="Lora Medium" w:hAnsi="Lora Medium" w:cs="Lora Medium" w:eastAsia="Lora Medium"/>
+          <w:b/>
+          <w:u w:val="single"/>
+          <w:shd w:val="clear" w:color="auto" w:fill="CFE2F3"/>
         </w:rPr>
         <w:t>Morreu sem receber um único centavo do que o Poder Judiciário lhe havia reconhecido.</w:t>
       </w:r>
@@ -359,18 +451,28 @@
         <w:jc w:val="both"/>
       </w:pPr>
       <w:r>
-        <w:rPr/>
+        <w:rPr>
+          <w:rFonts w:ascii="Lora Medium" w:hAnsi="Lora Medium" w:cs="Lora Medium" w:eastAsia="Lora Medium"/>
+        </w:rPr>
         <w:t>Os sucessores lamentam profundamente que ela não tenha podido usar esses recursos no período em que deles mais precisou. Este registro não tem o propósito de comover. Seu objetivo é deixar claro o custo humano da resistência injustificada do executado, circunstância que deve ser considerada por este Juízo na apreciação da conduta processual do banco (arts. 77, 80 e 774 do CPC) e que justifica a máxima celeridade na tramitação do feito daqui em diante.</w:t>
       </w:r>
     </w:p>
     <w:p>
       <w:pPr>
         <w:keepNext/>
+        <w:tabs>
+          <w:tab w:pos="1000" w:val="left"/>
+        </w:tabs>
         <w:spacing w:before="360" w:after="240" w:line="360" w:lineRule="auto"/>
-      </w:pPr>
-      <w:r>
-        <w:rPr>
-          <w:b/>
+        <w:ind w:left="0"/>
+        <w:shd w:val="clear" w:color="auto" w:fill="123BB8"/>
+      </w:pPr>
+      <w:r>
+        <w:rPr>
+          <w:rFonts w:ascii="Lora Medium" w:hAnsi="Lora Medium" w:cs="Lora Medium" w:eastAsia="Lora Medium"/>
+          <w:b/>
+          <w:i/>
+          <w:color w:val="FFFFFF"/>
         </w:rPr>
         <w:t>III.</w:t>
         <w:tab/>
@@ -380,12 +482,17 @@
     <w:p>
       <w:pPr>
         <w:keepNext/>
+        <w:tabs>
+          <w:tab w:pos="700" w:val="left"/>
+        </w:tabs>
         <w:spacing w:before="240" w:after="160" w:line="360" w:lineRule="auto"/>
         <w:ind w:left="700" w:hanging="400"/>
       </w:pPr>
       <w:r>
         <w:rPr>
-          <w:b/>
+          <w:rFonts w:ascii="Lora Medium" w:hAnsi="Lora Medium" w:cs="Lora Medium" w:eastAsia="Lora Medium"/>
+          <w:b/>
+          <w:i/>
         </w:rPr>
         <w:t>a.</w:t>
         <w:tab/>
@@ -399,7 +506,9 @@
         <w:jc w:val="both"/>
       </w:pPr>
       <w:r>
-        <w:rPr/>
+        <w:rPr>
+          <w:rFonts w:ascii="Lora Medium" w:hAnsi="Lora Medium" w:cs="Lora Medium" w:eastAsia="Lora Medium"/>
+        </w:rPr>
         <w:t>Com a morte de uma das partes, a sucessão processual se dá pelo espólio ou pelos sucessores, nos termos do art. 110 do CPC:</w:t>
       </w:r>
     </w:p>
@@ -408,22 +517,38 @@
         <w:spacing w:before="160" w:after="200" w:line="240" w:lineRule="auto"/>
         <w:ind w:left="2270" w:right="570"/>
         <w:jc w:val="both"/>
-      </w:pPr>
-      <w:r>
-        <w:rPr>
+        <w:pBdr>
+          <w:top w:val="single" w:color="9AA0A6" w:sz="4" w:space="6"/>
+        </w:pBdr>
+      </w:pPr>
+      <w:r>
+        <w:rPr>
+          <w:rFonts w:ascii="Lora Medium" w:hAnsi="Lora Medium" w:cs="Lora Medium" w:eastAsia="Lora Medium"/>
+          <w:b/>
+          <w:i/>
           <w:sz w:val="18"/>
         </w:rPr>
-        <w:t>Art. 110. Ocorrendo a morte de qualquer das partes, dar-se-á a sucessão pelo seu espólio ou pelos seus sucessores, observado o disposto no art. 313, §§ 1º e 2º.</w:t>
-      </w:r>
-    </w:p>
-    <w:p>
-      <w:pPr>
-        <w:spacing w:line="360" w:lineRule="auto" w:after="60"/>
-        <w:ind w:firstLine="850"/>
-        <w:jc w:val="both"/>
-      </w:pPr>
-      <w:r>
-        <w:rPr/>
+        <w:t>Art. 110.</w:t>
+      </w:r>
+      <w:r>
+        <w:rPr>
+          <w:rFonts w:ascii="Lora Medium" w:hAnsi="Lora Medium" w:cs="Lora Medium" w:eastAsia="Lora Medium"/>
+          <w:i/>
+          <w:sz w:val="18"/>
+        </w:rPr>
+        <w:t xml:space="preserve"> Ocorrendo a morte de qualquer das partes, dar-se-á a sucessão pelo seu espólio ou pelos seus sucessores, observado o disposto no art. 313, §§ 1º e 2º.</w:t>
+      </w:r>
+    </w:p>
+    <w:p>
+      <w:pPr>
+        <w:spacing w:line="360" w:lineRule="auto" w:after="60"/>
+        <w:ind w:firstLine="850"/>
+        <w:jc w:val="both"/>
+      </w:pPr>
+      <w:r>
+        <w:rPr>
+          <w:rFonts w:ascii="Lora Medium" w:hAnsi="Lora Medium" w:cs="Lora Medium" w:eastAsia="Lora Medium"/>
+        </w:rPr>
         <w:t>A habilitação pode ser requerida pelos próprios sucessores, nos autos do processo principal e na instância em que ele estiver (arts. 687, 688, II, e 689 do CPC):</w:t>
       </w:r>
     </w:p>
@@ -432,12 +557,26 @@
         <w:spacing w:before="160" w:after="200" w:line="240" w:lineRule="auto"/>
         <w:ind w:left="2270" w:right="570"/>
         <w:jc w:val="both"/>
-      </w:pPr>
-      <w:r>
-        <w:rPr>
+        <w:pBdr>
+          <w:top w:val="single" w:color="9AA0A6" w:sz="4" w:space="6"/>
+        </w:pBdr>
+      </w:pPr>
+      <w:r>
+        <w:rPr>
+          <w:rFonts w:ascii="Lora Medium" w:hAnsi="Lora Medium" w:cs="Lora Medium" w:eastAsia="Lora Medium"/>
+          <w:b/>
+          <w:i/>
           <w:sz w:val="18"/>
         </w:rPr>
-        <w:t>Art. 687. A habilitação ocorre quando, por falecimento de qualquer das partes, os interessados houverem de suceder-lhe no processo.</w:t>
+        <w:t>Art. 687.</w:t>
+      </w:r>
+      <w:r>
+        <w:rPr>
+          <w:rFonts w:ascii="Lora Medium" w:hAnsi="Lora Medium" w:cs="Lora Medium" w:eastAsia="Lora Medium"/>
+          <w:i/>
+          <w:sz w:val="18"/>
+        </w:rPr>
+        <w:t xml:space="preserve"> A habilitação ocorre quando, por falecimento de qualquer das partes, os interessados houverem de suceder-lhe no processo.</w:t>
       </w:r>
     </w:p>
     <w:p>
@@ -445,12 +584,26 @@
         <w:spacing w:before="160" w:after="200" w:line="240" w:lineRule="auto"/>
         <w:ind w:left="2270" w:right="570"/>
         <w:jc w:val="both"/>
-      </w:pPr>
-      <w:r>
-        <w:rPr>
+        <w:pBdr>
+          <w:top w:val="single" w:color="9AA0A6" w:sz="4" w:space="6"/>
+        </w:pBdr>
+      </w:pPr>
+      <w:r>
+        <w:rPr>
+          <w:rFonts w:ascii="Lora Medium" w:hAnsi="Lora Medium" w:cs="Lora Medium" w:eastAsia="Lora Medium"/>
+          <w:b/>
+          <w:i/>
           <w:sz w:val="18"/>
         </w:rPr>
-        <w:t>Art. 688. A habilitação pode ser requerida: (...) II - pelos sucessores do falecido, em relação à parte.</w:t>
+        <w:t>Art. 688.</w:t>
+      </w:r>
+      <w:r>
+        <w:rPr>
+          <w:rFonts w:ascii="Lora Medium" w:hAnsi="Lora Medium" w:cs="Lora Medium" w:eastAsia="Lora Medium"/>
+          <w:i/>
+          <w:sz w:val="18"/>
+        </w:rPr>
+        <w:t xml:space="preserve"> A habilitação pode ser requerida: (...) II - pelos sucessores do falecido, em relação à parte.</w:t>
       </w:r>
     </w:p>
     <w:p>
@@ -458,54 +611,85 @@
         <w:spacing w:before="160" w:after="200" w:line="240" w:lineRule="auto"/>
         <w:ind w:left="2270" w:right="570"/>
         <w:jc w:val="both"/>
-      </w:pPr>
-      <w:r>
-        <w:rPr>
+        <w:pBdr>
+          <w:top w:val="single" w:color="9AA0A6" w:sz="4" w:space="6"/>
+        </w:pBdr>
+      </w:pPr>
+      <w:r>
+        <w:rPr>
+          <w:rFonts w:ascii="Lora Medium" w:hAnsi="Lora Medium" w:cs="Lora Medium" w:eastAsia="Lora Medium"/>
+          <w:b/>
+          <w:i/>
           <w:sz w:val="18"/>
         </w:rPr>
-        <w:t>Art. 689. Proceder-se-á à habilitação nos autos do processo principal, na instância em que estiver, suspendendo-se, a partir de então, o processo.</w:t>
-      </w:r>
-    </w:p>
-    <w:p>
-      <w:pPr>
-        <w:spacing w:line="360" w:lineRule="auto" w:after="60"/>
-        <w:ind w:firstLine="850"/>
-        <w:jc w:val="both"/>
-      </w:pPr>
-      <w:r>
-        <w:rPr/>
+        <w:t>Art. 689.</w:t>
+      </w:r>
+      <w:r>
+        <w:rPr>
+          <w:rFonts w:ascii="Lora Medium" w:hAnsi="Lora Medium" w:cs="Lora Medium" w:eastAsia="Lora Medium"/>
+          <w:i/>
+          <w:sz w:val="18"/>
+        </w:rPr>
+        <w:t xml:space="preserve"> Proceder-se-á à habilitação nos autos do processo principal, na instância em que estiver, suspendendo-se, a partir de então, o processo.</w:t>
+      </w:r>
+    </w:p>
+    <w:p>
+      <w:pPr>
+        <w:spacing w:line="360" w:lineRule="auto" w:after="60"/>
+        <w:ind w:firstLine="850"/>
+        <w:jc w:val="both"/>
+      </w:pPr>
+      <w:r>
+        <w:rPr>
+          <w:rFonts w:ascii="Lora Medium" w:hAnsi="Lora Medium" w:cs="Lora Medium" w:eastAsia="Lora Medium"/>
+        </w:rPr>
         <w:t xml:space="preserve">Não havendo inventário aberto, a legitimidade é dos herdeiros, a quem a herança se transmite desde logo (art. 1.784 do CC). Os requerentes são </w:t>
       </w:r>
       <w:r>
         <w:rPr>
-          <w:b/>
+          <w:rFonts w:ascii="Lora Medium" w:hAnsi="Lora Medium" w:cs="Lora Medium" w:eastAsia="Lora Medium"/>
+          <w:b/>
+          <w:u w:val="single"/>
+          <w:shd w:val="clear" w:color="auto" w:fill="CFE2F3"/>
         </w:rPr>
         <w:t>todos</w:t>
       </w:r>
       <w:r>
-        <w:rPr/>
+        <w:rPr>
+          <w:rFonts w:ascii="Lora Medium" w:hAnsi="Lora Medium" w:cs="Lora Medium" w:eastAsia="Lora Medium"/>
+        </w:rPr>
         <w:t xml:space="preserve"> os sucessores da falecida: o cônjuge sobrevivente e os quatro filhos, conforme a certidão de óbito. A qualidade de cada um está provada documentalmente pelas certidões de óbito e de casamento e pelos documentos pessoais anexos. Por isso, o pedido comporta </w:t>
       </w:r>
       <w:r>
         <w:rPr>
-          <w:b/>
+          <w:rFonts w:ascii="Lora Medium" w:hAnsi="Lora Medium" w:cs="Lora Medium" w:eastAsia="Lora Medium"/>
+          <w:b/>
+          <w:u w:val="single"/>
+          <w:shd w:val="clear" w:color="auto" w:fill="CFE2F3"/>
         </w:rPr>
         <w:t>julgamento imediato</w:t>
       </w:r>
       <w:r>
-        <w:rPr/>
+        <w:rPr>
+          <w:rFonts w:ascii="Lora Medium" w:hAnsi="Lora Medium" w:cs="Lora Medium" w:eastAsia="Lora Medium"/>
+        </w:rPr>
         <w:t>, na forma do art. 691 do CPC.</w:t>
       </w:r>
     </w:p>
     <w:p>
       <w:pPr>
         <w:keepNext/>
+        <w:tabs>
+          <w:tab w:pos="700" w:val="left"/>
+        </w:tabs>
         <w:spacing w:before="240" w:after="160" w:line="360" w:lineRule="auto"/>
         <w:ind w:left="700" w:hanging="400"/>
       </w:pPr>
       <w:r>
         <w:rPr>
-          <w:b/>
+          <w:rFonts w:ascii="Lora Medium" w:hAnsi="Lora Medium" w:cs="Lora Medium" w:eastAsia="Lora Medium"/>
+          <w:b/>
+          <w:i/>
         </w:rPr>
         <w:t>b.</w:t>
         <w:tab/>
@@ -519,27 +703,37 @@
         <w:jc w:val="both"/>
       </w:pPr>
       <w:r>
-        <w:rPr/>
+        <w:rPr>
+          <w:rFonts w:ascii="Lora Medium" w:hAnsi="Lora Medium" w:cs="Lora Medium" w:eastAsia="Lora Medium"/>
+        </w:rPr>
         <w:t xml:space="preserve">O casamento foi celebrado em 15/09/1976, antes da Lei nº 6.515/1977, quando o regime legal era o da comunhão universal de bens (art. 258 do Código Civil de 1916). Assim, o cônjuge sobrevivente </w:t>
       </w:r>
       <w:r>
         <w:rPr>
+          <w:rFonts w:ascii="Lora Medium" w:hAnsi="Lora Medium" w:cs="Lora Medium" w:eastAsia="Lora Medium"/>
           <w:b/>
         </w:rPr>
         <w:t>Manoel Lopes da Silva</w:t>
       </w:r>
       <w:r>
-        <w:rPr/>
+        <w:rPr>
+          <w:rFonts w:ascii="Lora Medium" w:hAnsi="Lora Medium" w:cs="Lora Medium" w:eastAsia="Lora Medium"/>
+        </w:rPr>
         <w:t xml:space="preserve"> é titular da </w:t>
       </w:r>
       <w:r>
         <w:rPr>
-          <w:b/>
+          <w:rFonts w:ascii="Lora Medium" w:hAnsi="Lora Medium" w:cs="Lora Medium" w:eastAsia="Lora Medium"/>
+          <w:b/>
+          <w:u w:val="single"/>
+          <w:shd w:val="clear" w:color="auto" w:fill="CFE2F3"/>
         </w:rPr>
         <w:t>meação (50%)</w:t>
       </w:r>
       <w:r>
-        <w:rPr/>
+        <w:rPr>
+          <w:rFonts w:ascii="Lora Medium" w:hAnsi="Lora Medium" w:cs="Lora Medium" w:eastAsia="Lora Medium"/>
+        </w:rPr>
         <w:t xml:space="preserve"> do crédito. Nesse regime, ele não concorre com os descendentes na herança (art. 1.829, I, do CC).</w:t>
       </w:r>
     </w:p>
@@ -550,17 +744,24 @@
         <w:jc w:val="both"/>
       </w:pPr>
       <w:r>
-        <w:rPr/>
+        <w:rPr>
+          <w:rFonts w:ascii="Lora Medium" w:hAnsi="Lora Medium" w:cs="Lora Medium" w:eastAsia="Lora Medium"/>
+        </w:rPr>
         <w:t xml:space="preserve">A outra metade constitui a herança e cabe aos quatro filhos em partes iguais, ou seja, </w:t>
       </w:r>
       <w:r>
         <w:rPr>
-          <w:b/>
+          <w:rFonts w:ascii="Lora Medium" w:hAnsi="Lora Medium" w:cs="Lora Medium" w:eastAsia="Lora Medium"/>
+          <w:b/>
+          <w:u w:val="single"/>
+          <w:shd w:val="clear" w:color="auto" w:fill="CFE2F3"/>
         </w:rPr>
         <w:t>12,5% para cada um</w:t>
       </w:r>
       <w:r>
-        <w:rPr/>
+        <w:rPr>
+          <w:rFonts w:ascii="Lora Medium" w:hAnsi="Lora Medium" w:cs="Lora Medium" w:eastAsia="Lora Medium"/>
+        </w:rPr>
         <w:t xml:space="preserve"> (arts. 1.829, I, e 1.835 do CC).</w:t>
       </w:r>
     </w:p>
@@ -571,29 +772,41 @@
         <w:jc w:val="both"/>
       </w:pPr>
       <w:r>
-        <w:rPr/>
+        <w:rPr>
+          <w:rFonts w:ascii="Lora Medium" w:hAnsi="Lora Medium" w:cs="Lora Medium" w:eastAsia="Lora Medium"/>
+        </w:rPr>
         <w:t xml:space="preserve">Todos os filhos declararam, por escrito, estar de acordo com o demonstrativo financeiro e </w:t>
       </w:r>
       <w:r>
         <w:rPr>
-          <w:b/>
+          <w:rFonts w:ascii="Lora Medium" w:hAnsi="Lora Medium" w:cs="Lora Medium" w:eastAsia="Lora Medium"/>
+          <w:b/>
+          <w:u w:val="single"/>
+          <w:shd w:val="clear" w:color="auto" w:fill="CFE2F3"/>
         </w:rPr>
         <w:t>autorizaram expressamente que o levantamento das respectivas quotas seja feito por seu genitor, Manoel Lopes da Silva, como mandatário</w:t>
       </w:r>
       <w:r>
-        <w:rPr/>
+        <w:rPr>
+          <w:rFonts w:ascii="Lora Medium" w:hAnsi="Lora Medium" w:cs="Lora Medium" w:eastAsia="Lora Medium"/>
+        </w:rPr>
         <w:t>, sem que isso importe renúncia, cessão ou doação da quota hereditária. [Doc. 05] O levantamento dos valores depositados será requerido oportunamente, em momento próprio.</w:t>
       </w:r>
     </w:p>
     <w:p>
       <w:pPr>
         <w:keepNext/>
+        <w:tabs>
+          <w:tab w:pos="700" w:val="left"/>
+        </w:tabs>
         <w:spacing w:before="240" w:after="160" w:line="360" w:lineRule="auto"/>
         <w:ind w:left="700" w:hanging="400"/>
       </w:pPr>
       <w:r>
         <w:rPr>
-          <w:b/>
+          <w:rFonts w:ascii="Lora Medium" w:hAnsi="Lora Medium" w:cs="Lora Medium" w:eastAsia="Lora Medium"/>
+          <w:b/>
+          <w:i/>
         </w:rPr>
         <w:t>c.</w:t>
         <w:tab/>
@@ -607,7 +820,9 @@
         <w:jc w:val="both"/>
       </w:pPr>
       <w:r>
-        <w:rPr/>
+        <w:rPr>
+          <w:rFonts w:ascii="Lora Medium" w:hAnsi="Lora Medium" w:cs="Lora Medium" w:eastAsia="Lora Medium"/>
+        </w:rPr>
         <w:t>A falecida não deixou testamento, e não há inventário ou arrolamento aberto. Os requerentes são os únicos sucessores, todos maiores e capazes, e estão de acordo quanto à divisão do crédito. [Doc. 05]</w:t>
       </w:r>
     </w:p>
@@ -618,7 +833,9 @@
         <w:jc w:val="both"/>
       </w:pPr>
       <w:r>
-        <w:rPr/>
+        <w:rPr>
+          <w:rFonts w:ascii="Lora Medium" w:hAnsi="Lora Medium" w:cs="Lora Medium" w:eastAsia="Lora Medium"/>
+        </w:rPr>
         <w:t>Nessas condições, o inventário não é necessário para que os sucessores recebam o crédito aqui executado. Pelo princípio da saisine, a herança se transmite aos herdeiros no exato momento do óbito (art. 1.784 do CC). O art. 110 do CPC, por sua vez, admite expressamente a sucessão processual diretamente pelos sucessores, sem a figura do espólio.</w:t>
       </w:r>
     </w:p>
@@ -629,7 +846,9 @@
         <w:jc w:val="both"/>
       </w:pPr>
       <w:r>
-        <w:rPr/>
+        <w:rPr>
+          <w:rFonts w:ascii="Lora Medium" w:hAnsi="Lora Medium" w:cs="Lora Medium" w:eastAsia="Lora Medium"/>
+        </w:rPr>
         <w:t>Além disso, o crédito decorre da restituição de descontos indevidos feitos sobre o benefício previdenciário da falecida. Trata-se, na essência, de valores do benefício que ela deixou de receber em vida. Para valores dessa natureza, a lei dispensa expressamente o inventário:</w:t>
       </w:r>
     </w:p>
@@ -638,22 +857,38 @@
         <w:spacing w:before="160" w:after="200" w:line="240" w:lineRule="auto"/>
         <w:ind w:left="2270" w:right="570"/>
         <w:jc w:val="both"/>
-      </w:pPr>
-      <w:r>
-        <w:rPr>
+        <w:pBdr>
+          <w:top w:val="single" w:color="9AA0A6" w:sz="4" w:space="6"/>
+        </w:pBdr>
+      </w:pPr>
+      <w:r>
+        <w:rPr>
+          <w:rFonts w:ascii="Lora Medium" w:hAnsi="Lora Medium" w:cs="Lora Medium" w:eastAsia="Lora Medium"/>
+          <w:b/>
+          <w:i/>
           <w:sz w:val="18"/>
         </w:rPr>
-        <w:t>Lei nº 8.213/1991, art. 112. O valor não recebido em vida pelo segurado só será pago aos seus dependentes habilitados à pensão por morte ou, na falta deles, aos seus sucessores na forma da lei civil, independentemente de inventário ou arrolamento.</w:t>
-      </w:r>
-    </w:p>
-    <w:p>
-      <w:pPr>
-        <w:spacing w:line="360" w:lineRule="auto" w:after="60"/>
-        <w:ind w:firstLine="850"/>
-        <w:jc w:val="both"/>
-      </w:pPr>
-      <w:r>
-        <w:rPr/>
+        <w:t>Lei nº 8.213/1991, art. 112.</w:t>
+      </w:r>
+      <w:r>
+        <w:rPr>
+          <w:rFonts w:ascii="Lora Medium" w:hAnsi="Lora Medium" w:cs="Lora Medium" w:eastAsia="Lora Medium"/>
+          <w:i/>
+          <w:sz w:val="18"/>
+        </w:rPr>
+        <w:t xml:space="preserve"> O valor não recebido em vida pelo segurado só será pago aos seus dependentes habilitados à pensão por morte ou, na falta deles, aos seus sucessores na forma da lei civil, independentemente de inventário ou arrolamento.</w:t>
+      </w:r>
+    </w:p>
+    <w:p>
+      <w:pPr>
+        <w:spacing w:line="360" w:lineRule="auto" w:after="60"/>
+        <w:ind w:firstLine="850"/>
+        <w:jc w:val="both"/>
+      </w:pPr>
+      <w:r>
+        <w:rPr>
+          <w:rFonts w:ascii="Lora Medium" w:hAnsi="Lora Medium" w:cs="Lora Medium" w:eastAsia="Lora Medium"/>
+        </w:rPr>
         <w:t>A mesma orientação está no art. 666 do CPC, segundo o qual independe de inventário ou arrolamento o pagamento dos valores previstos na Lei nº 6.858/1980.</w:t>
       </w:r>
     </w:p>
@@ -664,7 +899,9 @@
         <w:jc w:val="both"/>
       </w:pPr>
       <w:r>
-        <w:rPr/>
+        <w:rPr>
+          <w:rFonts w:ascii="Lora Medium" w:hAnsi="Lora Medium" w:cs="Lora Medium" w:eastAsia="Lora Medium"/>
+        </w:rPr>
         <w:t>Exigir a abertura de inventário apenas para dividir um único crédito entre cinco sucessores que já estão de acordo imporia custo e demora desproporcionais a pessoas hipossuficientes, sem nenhum proveito para terceiros. Isso contrariaria a razoável duração do processo e a eficiência (arts. 4º e 8º do CPC). Eventuais outros bens deixados pela falecida não interferem neste crédito e serão tratados pelas vias próprias.</w:t>
       </w:r>
     </w:p>
@@ -675,29 +912,41 @@
         <w:jc w:val="both"/>
       </w:pPr>
       <w:r>
-        <w:rPr/>
+        <w:rPr>
+          <w:rFonts w:ascii="Lora Medium" w:hAnsi="Lora Medium" w:cs="Lora Medium" w:eastAsia="Lora Medium"/>
+        </w:rPr>
         <w:t xml:space="preserve">Por isso, requer-se que se reconheça, desde já, que o </w:t>
       </w:r>
       <w:r>
         <w:rPr>
-          <w:b/>
+          <w:rFonts w:ascii="Lora Medium" w:hAnsi="Lora Medium" w:cs="Lora Medium" w:eastAsia="Lora Medium"/>
+          <w:b/>
+          <w:u w:val="single"/>
+          <w:shd w:val="clear" w:color="auto" w:fill="CFE2F3"/>
         </w:rPr>
         <w:t>futuro levantamento dos valores independe de inventário ou arrolamento</w:t>
       </w:r>
       <w:r>
-        <w:rPr/>
+        <w:rPr>
+          <w:rFonts w:ascii="Lora Medium" w:hAnsi="Lora Medium" w:cs="Lora Medium" w:eastAsia="Lora Medium"/>
+        </w:rPr>
         <w:t xml:space="preserve"> e deverá ser feito diretamente aos sucessores habilitados, na proporção de 50% ao cônjuge meeiro e 12,5% a cada filho.</w:t>
       </w:r>
     </w:p>
     <w:p>
       <w:pPr>
         <w:keepNext/>
+        <w:tabs>
+          <w:tab w:pos="700" w:val="left"/>
+        </w:tabs>
         <w:spacing w:before="240" w:after="160" w:line="360" w:lineRule="auto"/>
         <w:ind w:left="700" w:hanging="400"/>
       </w:pPr>
       <w:r>
         <w:rPr>
-          <w:b/>
+          <w:rFonts w:ascii="Lora Medium" w:hAnsi="Lora Medium" w:cs="Lora Medium" w:eastAsia="Lora Medium"/>
+          <w:b/>
+          <w:i/>
         </w:rPr>
         <w:t>d.</w:t>
         <w:tab/>
@@ -711,17 +960,24 @@
         <w:jc w:val="both"/>
       </w:pPr>
       <w:r>
-        <w:rPr/>
+        <w:rPr>
+          <w:rFonts w:ascii="Lora Medium" w:hAnsi="Lora Medium" w:cs="Lora Medium" w:eastAsia="Lora Medium"/>
+        </w:rPr>
         <w:t xml:space="preserve">A morte da parte suspende o processo (art. 313, I, do CPC). Durante a suspensão, os prazos ficam suspensos e devem ser </w:t>
       </w:r>
       <w:r>
         <w:rPr>
-          <w:b/>
+          <w:rFonts w:ascii="Lora Medium" w:hAnsi="Lora Medium" w:cs="Lora Medium" w:eastAsia="Lora Medium"/>
+          <w:b/>
+          <w:u w:val="single"/>
+          <w:shd w:val="clear" w:color="auto" w:fill="CFE2F3"/>
         </w:rPr>
         <w:t>restituídos por tempo igual ao que faltava</w:t>
       </w:r>
       <w:r>
-        <w:rPr/>
+        <w:rPr>
+          <w:rFonts w:ascii="Lora Medium" w:hAnsi="Lora Medium" w:cs="Lora Medium" w:eastAsia="Lora Medium"/>
+        </w:rPr>
         <w:t xml:space="preserve"> para sua complementação (art. 221 do CPC).</w:t>
       </w:r>
     </w:p>
@@ -732,7 +988,9 @@
         <w:jc w:val="both"/>
       </w:pPr>
       <w:r>
-        <w:rPr/>
+        <w:rPr>
+          <w:rFonts w:ascii="Lora Medium" w:hAnsi="Lora Medium" w:cs="Lora Medium" w:eastAsia="Lora Medium"/>
+        </w:rPr>
         <w:t>No caso, o óbito (16/07/2026) foi anterior à decisão de ID 102074323 (03/08/2026), à interposição do Agravo de Instrumento nº 0763031-67.2026.8.18.0000 e à decisão do Relator que determinou a intimação da agravada para contrarrazões (03/09/2026). Em razão do óbito, e com o mandato anterior extinto (art. 682, II, do CC), a exequente ficou sem representação a partir de 16/07/2026.</w:t>
       </w:r>
     </w:p>
@@ -743,29 +1001,41 @@
         <w:jc w:val="both"/>
       </w:pPr>
       <w:r>
-        <w:rPr/>
+        <w:rPr>
+          <w:rFonts w:ascii="Lora Medium" w:hAnsi="Lora Medium" w:cs="Lora Medium" w:eastAsia="Lora Medium"/>
+        </w:rPr>
         <w:t xml:space="preserve">Por isso, requer-se que se reconheça a suspensão do feito desde a data do óbito e que, deferida a habilitação, </w:t>
       </w:r>
       <w:r>
         <w:rPr>
-          <w:b/>
+          <w:rFonts w:ascii="Lora Medium" w:hAnsi="Lora Medium" w:cs="Lora Medium" w:eastAsia="Lora Medium"/>
+          <w:b/>
+          <w:u w:val="single"/>
+          <w:shd w:val="clear" w:color="auto" w:fill="CFE2F3"/>
         </w:rPr>
         <w:t>os prazos em curso sejam restituídos aos sucessores</w:t>
       </w:r>
       <w:r>
-        <w:rPr/>
+        <w:rPr>
+          <w:rFonts w:ascii="Lora Medium" w:hAnsi="Lora Medium" w:cs="Lora Medium" w:eastAsia="Lora Medium"/>
+        </w:rPr>
         <w:t>, em especial o prazo para contrarrazões ao agravo de instrumento. Requer-se, ainda, que o Egrégio TJPI seja comunicado para regularizar o polo passivo do recurso.</w:t>
       </w:r>
     </w:p>
     <w:p>
       <w:pPr>
         <w:keepNext/>
+        <w:tabs>
+          <w:tab w:pos="700" w:val="left"/>
+        </w:tabs>
         <w:spacing w:before="240" w:after="160" w:line="360" w:lineRule="auto"/>
         <w:ind w:left="700" w:hanging="400"/>
       </w:pPr>
       <w:r>
         <w:rPr>
-          <w:b/>
+          <w:rFonts w:ascii="Lora Medium" w:hAnsi="Lora Medium" w:cs="Lora Medium" w:eastAsia="Lora Medium"/>
+          <w:b/>
+          <w:i/>
         </w:rPr>
         <w:t>e.</w:t>
         <w:tab/>
@@ -779,19 +1049,26 @@
         <w:jc w:val="both"/>
       </w:pPr>
       <w:r>
-        <w:rPr/>
+        <w:rPr>
+          <w:rFonts w:ascii="Lora Medium" w:hAnsi="Lora Medium" w:cs="Lora Medium" w:eastAsia="Lora Medium"/>
+        </w:rPr>
         <w:t>A falecida litigava sob o benefício da justiça gratuita. Os requerentes são lavradores e não têm condições de arcar com custas e despesas processuais sem prejuízo do próprio sustento, conforme as declarações de hipossuficiência anexas (arts. 98 e 99, § 3º, do CPC). Requerem, portanto, a concessão do benefício a cada um deles. [Doc. 04]</w:t>
       </w:r>
     </w:p>
     <w:p>
       <w:pPr>
         <w:keepNext/>
+        <w:tabs>
+          <w:tab w:pos="700" w:val="left"/>
+        </w:tabs>
         <w:spacing w:before="240" w:after="160" w:line="360" w:lineRule="auto"/>
         <w:ind w:left="700" w:hanging="400"/>
       </w:pPr>
       <w:r>
         <w:rPr>
-          <w:b/>
+          <w:rFonts w:ascii="Lora Medium" w:hAnsi="Lora Medium" w:cs="Lora Medium" w:eastAsia="Lora Medium"/>
+          <w:b/>
+          <w:i/>
         </w:rPr>
         <w:t>f.</w:t>
         <w:tab/>
@@ -805,18 +1082,28 @@
         <w:jc w:val="both"/>
       </w:pPr>
       <w:r>
-        <w:rPr/>
+        <w:rPr>
+          <w:rFonts w:ascii="Lora Medium" w:hAnsi="Lora Medium" w:cs="Lora Medium" w:eastAsia="Lora Medium"/>
+        </w:rPr>
         <w:t>A exequente tinha direito à prioridade de tramitação, por ser idosa e portadora de doença grave (art. 1.048, I, do CPC). Essa prioridade não cessa com a morte e se estende ao cônjuge sobrevivente (art. 1.048, § 3º, do CPC, e art. 71, § 2º, da Lei nº 10.741/2003). Além disso, o requerente Manoel Lopes da Silva tem 72 anos e faz jus ao benefício por direito próprio (art. 1.048, I, do CPC).</w:t>
       </w:r>
     </w:p>
     <w:p>
       <w:pPr>
         <w:keepNext/>
+        <w:tabs>
+          <w:tab w:pos="1000" w:val="left"/>
+        </w:tabs>
         <w:spacing w:before="360" w:after="240" w:line="360" w:lineRule="auto"/>
-      </w:pPr>
-      <w:r>
-        <w:rPr>
-          <w:b/>
+        <w:ind w:left="0"/>
+        <w:shd w:val="clear" w:color="auto" w:fill="123BB8"/>
+      </w:pPr>
+      <w:r>
+        <w:rPr>
+          <w:rFonts w:ascii="Lora Medium" w:hAnsi="Lora Medium" w:cs="Lora Medium" w:eastAsia="Lora Medium"/>
+          <w:b/>
+          <w:i/>
+          <w:color w:val="FFFFFF"/>
         </w:rPr>
         <w:t>IV.</w:t>
         <w:tab/>
@@ -830,7 +1117,9 @@
         <w:jc w:val="both"/>
       </w:pPr>
       <w:r>
-        <w:rPr/>
+        <w:rPr>
+          <w:rFonts w:ascii="Lora Medium" w:hAnsi="Lora Medium" w:cs="Lora Medium" w:eastAsia="Lora Medium"/>
+        </w:rPr>
         <w:t>Diante do exposto, requer:</w:t>
       </w:r>
     </w:p>
@@ -841,19 +1130,24 @@
         <w:jc w:val="both"/>
       </w:pPr>
       <w:r>
-        <w:rPr/>
+        <w:rPr>
+          <w:rFonts w:ascii="Lora Medium" w:hAnsi="Lora Medium" w:cs="Lora Medium" w:eastAsia="Lora Medium"/>
+        </w:rPr>
         <w:t>a)</w:t>
         <w:tab/>
         <w:t xml:space="preserve">o recebimento e o processamento da presente habilitação nos próprios autos (art. 689 do CPC), com a </w:t>
       </w:r>
       <w:r>
         <w:rPr>
+          <w:rFonts w:ascii="Lora Medium" w:hAnsi="Lora Medium" w:cs="Lora Medium" w:eastAsia="Lora Medium"/>
           <w:b/>
         </w:rPr>
         <w:t>suspensão do feito desde 16/07/2026</w:t>
       </w:r>
       <w:r>
-        <w:rPr/>
+        <w:rPr>
+          <w:rFonts w:ascii="Lora Medium" w:hAnsi="Lora Medium" w:cs="Lora Medium" w:eastAsia="Lora Medium"/>
+        </w:rPr>
         <w:t>, data do óbito (art. 313, I, do CPC);</w:t>
       </w:r>
     </w:p>
@@ -864,7 +1158,9 @@
         <w:jc w:val="both"/>
       </w:pPr>
       <w:r>
-        <w:rPr/>
+        <w:rPr>
+          <w:rFonts w:ascii="Lora Medium" w:hAnsi="Lora Medium" w:cs="Lora Medium" w:eastAsia="Lora Medium"/>
+        </w:rPr>
         <w:t>b)</w:t>
         <w:tab/>
         <w:t>a intimação do executado BANCO PAN S.A., na pessoa de seu advogado constituído, para se manifestar no prazo de 5 (cinco) dias (art. 690 do CPC);</w:t>
@@ -877,19 +1173,24 @@
         <w:jc w:val="both"/>
       </w:pPr>
       <w:r>
-        <w:rPr/>
+        <w:rPr>
+          <w:rFonts w:ascii="Lora Medium" w:hAnsi="Lora Medium" w:cs="Lora Medium" w:eastAsia="Lora Medium"/>
+        </w:rPr>
         <w:t>c)</w:t>
         <w:tab/>
         <w:t xml:space="preserve">o </w:t>
       </w:r>
       <w:r>
         <w:rPr>
+          <w:rFonts w:ascii="Lora Medium" w:hAnsi="Lora Medium" w:cs="Lora Medium" w:eastAsia="Lora Medium"/>
           <w:b/>
         </w:rPr>
         <w:t>julgamento imediato</w:t>
       </w:r>
       <w:r>
-        <w:rPr/>
+        <w:rPr>
+          <w:rFonts w:ascii="Lora Medium" w:hAnsi="Lora Medium" w:cs="Lora Medium" w:eastAsia="Lora Medium"/>
+        </w:rPr>
         <w:t xml:space="preserve"> do pedido (art. 691 do CPC), declarando habilitados MANOEL LOPES DA SILVA, como cônjuge meeiro e sucessor, e JAILENE SOUSA SILVA RODRIGUES, JOEL CARLOS SOUSA SILVA, GEAN CARLOS SOUSA SILVA e JANAÍNA DE SOUSA SILVA, como herdeiros, em substituição à exequente falecida, com a retificação do polo ativo no sistema PJe;</w:t>
       </w:r>
     </w:p>
@@ -900,19 +1201,24 @@
         <w:jc w:val="both"/>
       </w:pPr>
       <w:r>
-        <w:rPr/>
+        <w:rPr>
+          <w:rFonts w:ascii="Lora Medium" w:hAnsi="Lora Medium" w:cs="Lora Medium" w:eastAsia="Lora Medium"/>
+        </w:rPr>
         <w:t>d)</w:t>
         <w:tab/>
         <w:t xml:space="preserve">o reconhecimento de que a falecida não deixou testamento nem há inventário aberto e de que o </w:t>
       </w:r>
       <w:r>
         <w:rPr>
+          <w:rFonts w:ascii="Lora Medium" w:hAnsi="Lora Medium" w:cs="Lora Medium" w:eastAsia="Lora Medium"/>
           <w:b/>
         </w:rPr>
         <w:t>futuro levantamento dos valores independe de inventário ou arrolamento</w:t>
       </w:r>
       <w:r>
-        <w:rPr/>
+        <w:rPr>
+          <w:rFonts w:ascii="Lora Medium" w:hAnsi="Lora Medium" w:cs="Lora Medium" w:eastAsia="Lora Medium"/>
+        </w:rPr>
         <w:t>, devendo ser feito diretamente aos sucessores habilitados, na proporção de 50% ao cônjuge meeiro e 12,5% a cada filho (art. 1.784 do CC; art. 112 da Lei nº 8.213/1991; art. 666 do CPC);</w:t>
       </w:r>
     </w:p>
@@ -923,19 +1229,24 @@
         <w:jc w:val="both"/>
       </w:pPr>
       <w:r>
-        <w:rPr/>
+        <w:rPr>
+          <w:rFonts w:ascii="Lora Medium" w:hAnsi="Lora Medium" w:cs="Lora Medium" w:eastAsia="Lora Medium"/>
+        </w:rPr>
         <w:t>e)</w:t>
         <w:tab/>
         <w:t xml:space="preserve">a concessão dos benefícios da </w:t>
       </w:r>
       <w:r>
         <w:rPr>
+          <w:rFonts w:ascii="Lora Medium" w:hAnsi="Lora Medium" w:cs="Lora Medium" w:eastAsia="Lora Medium"/>
           <w:b/>
         </w:rPr>
         <w:t>justiça gratuita</w:t>
       </w:r>
       <w:r>
-        <w:rPr/>
+        <w:rPr>
+          <w:rFonts w:ascii="Lora Medium" w:hAnsi="Lora Medium" w:cs="Lora Medium" w:eastAsia="Lora Medium"/>
+        </w:rPr>
         <w:t xml:space="preserve"> a todos os requerentes (arts. 98 e 99 do CPC);</w:t>
       </w:r>
     </w:p>
@@ -946,19 +1257,24 @@
         <w:jc w:val="both"/>
       </w:pPr>
       <w:r>
-        <w:rPr/>
+        <w:rPr>
+          <w:rFonts w:ascii="Lora Medium" w:hAnsi="Lora Medium" w:cs="Lora Medium" w:eastAsia="Lora Medium"/>
+        </w:rPr>
         <w:t>f)</w:t>
         <w:tab/>
         <w:t xml:space="preserve">a concessão ou manutenção da </w:t>
       </w:r>
       <w:r>
         <w:rPr>
+          <w:rFonts w:ascii="Lora Medium" w:hAnsi="Lora Medium" w:cs="Lora Medium" w:eastAsia="Lora Medium"/>
           <w:b/>
         </w:rPr>
         <w:t>prioridade de tramitação</w:t>
       </w:r>
       <w:r>
-        <w:rPr/>
+        <w:rPr>
+          <w:rFonts w:ascii="Lora Medium" w:hAnsi="Lora Medium" w:cs="Lora Medium" w:eastAsia="Lora Medium"/>
+        </w:rPr>
         <w:t xml:space="preserve"> (art. 1.048, I e § 3º, do CPC; art. 71, § 2º, da Lei nº 10.741/2003);</w:t>
       </w:r>
     </w:p>
@@ -969,19 +1285,24 @@
         <w:jc w:val="both"/>
       </w:pPr>
       <w:r>
-        <w:rPr/>
+        <w:rPr>
+          <w:rFonts w:ascii="Lora Medium" w:hAnsi="Lora Medium" w:cs="Lora Medium" w:eastAsia="Lora Medium"/>
+        </w:rPr>
         <w:t>g)</w:t>
         <w:tab/>
         <w:t xml:space="preserve">o reconhecimento de que os prazos em curso ficaram suspensos desde o óbito, com sua </w:t>
       </w:r>
       <w:r>
         <w:rPr>
+          <w:rFonts w:ascii="Lora Medium" w:hAnsi="Lora Medium" w:cs="Lora Medium" w:eastAsia="Lora Medium"/>
           <w:b/>
         </w:rPr>
         <w:t>restituição integral aos sucessores</w:t>
       </w:r>
       <w:r>
-        <w:rPr/>
+        <w:rPr>
+          <w:rFonts w:ascii="Lora Medium" w:hAnsi="Lora Medium" w:cs="Lora Medium" w:eastAsia="Lora Medium"/>
+        </w:rPr>
         <w:t xml:space="preserve"> após a habilitação (art. 221 do CPC);</w:t>
       </w:r>
     </w:p>
@@ -992,19 +1313,24 @@
         <w:jc w:val="both"/>
       </w:pPr>
       <w:r>
-        <w:rPr/>
+        <w:rPr>
+          <w:rFonts w:ascii="Lora Medium" w:hAnsi="Lora Medium" w:cs="Lora Medium" w:eastAsia="Lora Medium"/>
+        </w:rPr>
         <w:t>h)</w:t>
         <w:tab/>
         <w:t xml:space="preserve">a comunicação da presente habilitação ao Excelentíssimo Desembargador Relator do </w:t>
       </w:r>
       <w:r>
         <w:rPr>
+          <w:rFonts w:ascii="Lora Medium" w:hAnsi="Lora Medium" w:cs="Lora Medium" w:eastAsia="Lora Medium"/>
           <w:b/>
         </w:rPr>
         <w:t>Agravo de Instrumento nº 0763031-67.2026.8.18.0000</w:t>
       </w:r>
       <w:r>
-        <w:rPr/>
+        <w:rPr>
+          <w:rFonts w:ascii="Lora Medium" w:hAnsi="Lora Medium" w:cs="Lora Medium" w:eastAsia="Lora Medium"/>
+        </w:rPr>
         <w:t>, para regularização do polo passivo do recurso e restituição do prazo para contrarrazões;</w:t>
       </w:r>
     </w:p>
@@ -1015,7 +1341,9 @@
         <w:jc w:val="both"/>
       </w:pPr>
       <w:r>
-        <w:rPr/>
+        <w:rPr>
+          <w:rFonts w:ascii="Lora Medium" w:hAnsi="Lora Medium" w:cs="Lora Medium" w:eastAsia="Lora Medium"/>
+        </w:rPr>
         <w:t>i)</w:t>
         <w:tab/>
         <w:t>que todas as intimações sejam feitas em nome do advogado ANTÔNIO DE PÁDUA SANTOS NETO, OAB/PI 21.320, sob pena de nulidade.</w:t>
@@ -1029,7 +1357,9 @@
         <w:jc w:val="both"/>
       </w:pPr>
       <w:r>
-        <w:rPr/>
+        <w:rPr>
+          <w:rFonts w:ascii="Lora Medium" w:hAnsi="Lora Medium" w:cs="Lora Medium" w:eastAsia="Lora Medium"/>
+        </w:rPr>
         <w:t>Protesta provar o alegado por todos os meios de prova admitidos, em especial pelos documentos anexos.</w:t>
       </w:r>
     </w:p>
@@ -1040,6 +1370,7 @@
       </w:pPr>
       <w:r>
         <w:rPr>
+          <w:rFonts w:ascii="Lora Medium" w:hAnsi="Lora Medium" w:cs="Lora Medium" w:eastAsia="Lora Medium"/>
           <w:b/>
         </w:rPr>
         <w:t>Documentos anexos:</w:t>
@@ -1050,7 +1381,9 @@
         <w:spacing w:line="360" w:lineRule="auto" w:after="0"/>
       </w:pPr>
       <w:r>
-        <w:rPr/>
+        <w:rPr>
+          <w:rFonts w:ascii="Lora Medium" w:hAnsi="Lora Medium" w:cs="Lora Medium" w:eastAsia="Lora Medium"/>
+        </w:rPr>
         <w:t>[Doc. 01 – Certidão de óbito de Francisca Sousa da Silva;]</w:t>
       </w:r>
     </w:p>
@@ -1059,7 +1392,9 @@
         <w:spacing w:line="360" w:lineRule="auto" w:after="0"/>
       </w:pPr>
       <w:r>
-        <w:rPr/>
+        <w:rPr>
+          <w:rFonts w:ascii="Lora Medium" w:hAnsi="Lora Medium" w:cs="Lora Medium" w:eastAsia="Lora Medium"/>
+        </w:rPr>
         <w:t>[Doc. 02 – Certidão de casamento de Manoel Lopes da Silva e Francisca Sousa da Silva;]</w:t>
       </w:r>
     </w:p>
@@ -1068,7 +1403,9 @@
         <w:spacing w:line="360" w:lineRule="auto" w:after="0"/>
       </w:pPr>
       <w:r>
-        <w:rPr/>
+        <w:rPr>
+          <w:rFonts w:ascii="Lora Medium" w:hAnsi="Lora Medium" w:cs="Lora Medium" w:eastAsia="Lora Medium"/>
+        </w:rPr>
         <w:t>[Doc. 03 – Procurações dos cinco requerentes;]</w:t>
       </w:r>
     </w:p>
@@ -1077,7 +1414,9 @@
         <w:spacing w:line="360" w:lineRule="auto" w:after="0"/>
       </w:pPr>
       <w:r>
-        <w:rPr/>
+        <w:rPr>
+          <w:rFonts w:ascii="Lora Medium" w:hAnsi="Lora Medium" w:cs="Lora Medium" w:eastAsia="Lora Medium"/>
+        </w:rPr>
         <w:t>[Doc. 04 – Declarações de hipossuficiência econômica dos cinco requerentes;]</w:t>
       </w:r>
     </w:p>
@@ -1086,7 +1425,9 @@
         <w:spacing w:line="360" w:lineRule="auto" w:after="0"/>
       </w:pPr>
       <w:r>
-        <w:rPr/>
+        <w:rPr>
+          <w:rFonts w:ascii="Lora Medium" w:hAnsi="Lora Medium" w:cs="Lora Medium" w:eastAsia="Lora Medium"/>
+        </w:rPr>
         <w:t>[Doc. 05 – Declarações de concordância e autorização para levantamento (Jailene, Joel, Gean e Janaína);]</w:t>
       </w:r>
     </w:p>
@@ -1095,7 +1436,9 @@
         <w:spacing w:line="360" w:lineRule="auto" w:after="0"/>
       </w:pPr>
       <w:r>
-        <w:rPr/>
+        <w:rPr>
+          <w:rFonts w:ascii="Lora Medium" w:hAnsi="Lora Medium" w:cs="Lora Medium" w:eastAsia="Lora Medium"/>
+        </w:rPr>
         <w:t>[Doc. 06 – Documentos de identidade dos requerentes;]</w:t>
       </w:r>
     </w:p>
@@ -1104,7 +1447,9 @@
         <w:spacing w:line="360" w:lineRule="auto" w:after="0"/>
       </w:pPr>
       <w:r>
-        <w:rPr/>
+        <w:rPr>
+          <w:rFonts w:ascii="Lora Medium" w:hAnsi="Lora Medium" w:cs="Lora Medium" w:eastAsia="Lora Medium"/>
+        </w:rPr>
         <w:t>[Doc. 07 – Comprovantes de residência dos requerentes (Rua Picos, nº 506: conta de água em nome de Manoel Lopes da Silva, residência também de Joel Carlos);]</w:t>
       </w:r>
     </w:p>
@@ -1113,7 +1458,9 @@
         <w:spacing w:line="360" w:lineRule="auto" w:after="0"/>
       </w:pPr>
       <w:r>
-        <w:rPr/>
+        <w:rPr>
+          <w:rFonts w:ascii="Lora Medium" w:hAnsi="Lora Medium" w:cs="Lora Medium" w:eastAsia="Lora Medium"/>
+        </w:rPr>
         <w:t>[Doc. 08 – Certidões de nascimento de Janaína, Joel Carlos e Gean Carlos.]</w:t>
       </w:r>
     </w:p>
@@ -1124,7 +1471,9 @@
         <w:jc w:val="center"/>
       </w:pPr>
       <w:r>
-        <w:rPr/>
+        <w:rPr>
+          <w:rFonts w:ascii="Lora Medium" w:hAnsi="Lora Medium" w:cs="Lora Medium" w:eastAsia="Lora Medium"/>
+        </w:rPr>
         <w:t>Nestes termos,</w:t>
       </w:r>
     </w:p>
@@ -1134,7 +1483,9 @@
         <w:jc w:val="center"/>
       </w:pPr>
       <w:r>
-        <w:rPr/>
+        <w:rPr>
+          <w:rFonts w:ascii="Lora Medium" w:hAnsi="Lora Medium" w:cs="Lora Medium" w:eastAsia="Lora Medium"/>
+        </w:rPr>
         <w:t>Pede deferimento.</w:t>
       </w:r>
     </w:p>
@@ -1145,7 +1496,9 @@
         <w:jc w:val="center"/>
       </w:pPr>
       <w:r>
-        <w:rPr/>
+        <w:rPr>
+          <w:rFonts w:ascii="Lora Medium" w:hAnsi="Lora Medium" w:cs="Lora Medium" w:eastAsia="Lora Medium"/>
+        </w:rPr>
         <w:t>Miguel Alves-PI, datado eletronicamente.</w:t>
       </w:r>
     </w:p>
@@ -1158,6 +1511,7 @@
       </w:pPr>
       <w:r>
         <w:rPr>
+          <w:rFonts w:ascii="Lora Medium" w:hAnsi="Lora Medium" w:cs="Lora Medium" w:eastAsia="Lora Medium"/>
           <w:b/>
         </w:rPr>
         <w:t>ANTÔNIO DE PÁDUA SANTOS NETO</w:t>
@@ -1169,7 +1523,9 @@
         <w:jc w:val="center"/>
       </w:pPr>
       <w:r>
-        <w:rPr/>
+        <w:rPr>
+          <w:rFonts w:ascii="Lora Medium" w:hAnsi="Lora Medium" w:cs="Lora Medium" w:eastAsia="Lora Medium"/>
+        </w:rPr>
         <w:t>ADVOGADO - OAB/PI 21.320</w:t>
       </w:r>
     </w:p>

</xml_diff>